<commit_message>
docs: cap nhat tai lieu v3.0 - Gemini API key (bo Vertex AI)
- ONBOARDING_GUIDE.docx v3.0: don gian hoa onboarding
  + Bo yeu cau cai gcloud, tao ADC, login GCP
  + Team chi can: Docker + Git + pull code + docker compose up
  + API key nhung san, config san, 14 buoc checklist (giam tu 18)
  + Chuong 6 viet lai hoan toan: Cau hinh moi truong (.env)
  + Cap nhat loi 12.3, 12.5: Gemini API thay Vertex AI
  + Cap nhat bao mat: .env da commit trong private repo
- ONBOARDING_GUIDE.md: dong bo voi DOCX
- TAI_LIEU_DU_AN_HR_ANALYTICS.md: Vertex AI -> Gemini API
- generate_onboarding_docx.py v3.0: bo GCP_PROJECT constant
</commit_message>
<xml_diff>
--- a/ONBOARDING_GUIDE.docx
+++ b/ONBOARDING_GUIDE.docx
@@ -88,7 +88,7 @@
           <w:b/>
           <w:sz w:val="22"/>
         </w:rPr>
-        <w:t>2.0</w:t>
+        <w:t>3.0</w:t>
       </w:r>
     </w:p>
     <w:p>
@@ -243,7 +243,7 @@
         <w:rPr>
           <w:sz w:val="22"/>
         </w:rPr>
-        <w:t>6. Cấu hình Vertex AI Authentication (Google Cloud)</w:t>
+        <w:t>6. Cấu hình môi trường (.env)</w:t>
       </w:r>
     </w:p>
     <w:p>
@@ -785,7 +785,7 @@
               <w:rPr>
                 <w:sz w:val="20"/>
               </w:rPr>
-              <w:t>Python, LiteLLM, Gemini</w:t>
+              <w:t>Python, LiteLLM, Gemini API</w:t>
             </w:r>
           </w:p>
         </w:tc>
@@ -1034,7 +1034,7 @@
     <w:p/>
     <w:p>
       <w:r>
-        <w:t>Luồng hoạt động: Người dùng nhập câu hỏi tại Wren UI (port 3000) → Wren AI Service gọi Gemini API để chuyển thành SQL → Wren Engine thực thi SQL trên database → kết quả trả về hiển thị trên giao diện web kèm biểu đồ.</w:t>
+        <w:t>Luồng hoạt động: Người dùng nhập câu hỏi tại Wren UI (port 3000) → Wren AI Service gọi Google Gemini API để chuyển thành SQL → Wren Engine thực thi SQL trên database → kết quả trả về hiển thị trên giao diện web kèm biểu đồ.</w:t>
       </w:r>
     </w:p>
     <w:p>
@@ -1060,7 +1060,7 @@
     </w:p>
     <w:p>
       <w:r>
-        <w:t>Các thành viên đã được cấp quyền trên cả hai nền tảng GitLab và Google Cloud Platform (GCP):</w:t>
+        <w:t>Các thành viên đã được cấp quyền Developer trên GitLab. API key Gemini đã được nhúng sẵn trong dự án — không cần cấu hình thêm.</w:t>
       </w:r>
     </w:p>
     <w:tbl>
@@ -1153,7 +1153,7 @@
                 <w:color w:val="FFFFFF"/>
                 <w:sz w:val="20"/>
               </w:rPr>
-              <w:t>Quyền GCP (IAM)</w:t>
+              <w:t>Vai trò dự án</w:t>
             </w:r>
           </w:p>
         </w:tc>
@@ -1211,7 +1211,7 @@
               <w:rPr>
                 <w:sz w:val="20"/>
               </w:rPr>
-              <w:t>Service Usage Consumer, Vertex AI User</w:t>
+              <w:t>AI Engineering</w:t>
             </w:r>
           </w:p>
         </w:tc>
@@ -1273,7 +1273,7 @@
               <w:rPr>
                 <w:sz w:val="20"/>
               </w:rPr>
-              <w:t>Service Usage Consumer, Vertex AI User</w:t>
+              <w:t>Data Pipeline &amp; MLOps</w:t>
             </w:r>
           </w:p>
         </w:tc>
@@ -1331,7 +1331,7 @@
               <w:rPr>
                 <w:sz w:val="20"/>
               </w:rPr>
-              <w:t>Service Usage Consumer, Vertex AI User</w:t>
+              <w:t>AI Engineering</w:t>
             </w:r>
           </w:p>
         </w:tc>
@@ -1393,7 +1393,7 @@
               <w:rPr>
                 <w:sz w:val="20"/>
               </w:rPr>
-              <w:t>Service Usage Consumer, Vertex AI User</w:t>
+              <w:t>AI Engineering (Lead)</w:t>
             </w:r>
           </w:p>
         </w:tc>
@@ -1528,12 +1528,12 @@
         <w:pStyle w:val="Heading2"/>
       </w:pPr>
       <w:r>
-        <w:t>2.3. Phân quyền Google Cloud Platform (GCP)</w:t>
+        <w:t>2.3. Gemini API — đã nhúng sẵn trong dự án</w:t>
       </w:r>
     </w:p>
     <w:p>
       <w:r>
-        <w:t>Mỗi thành viên đã được cấp hai vai trò trên GCP project project-ba49e1b7-26e0-4cbf-a14:</w:t>
+        <w:t>Hệ thống sử dụng Google Gemini API (qua Google AI Studio) với API key được nhúng sẵn trong file .env của dự án. Thành viên chỉ cần pull code về và chạy docker compose up -d là hệ thống hoạt động ngay, không cần cấu hình API key riêng.</w:t>
       </w:r>
     </w:p>
     <w:tbl>
@@ -1544,13 +1544,14 @@
         <w:tblLook w:firstColumn="1" w:firstRow="1" w:lastColumn="0" w:lastRow="0" w:noHBand="0" w:noVBand="1" w:val="04A0"/>
       </w:tblPr>
       <w:tblGrid>
-        <w:gridCol w:w="4561"/>
-        <w:gridCol w:w="4561"/>
+        <w:gridCol w:w="3041"/>
+        <w:gridCol w:w="3041"/>
+        <w:gridCol w:w="3041"/>
       </w:tblGrid>
       <w:tr>
         <w:tc>
           <w:tcPr>
-            <w:tcW w:type="dxa" w:w="2835"/>
+            <w:tcW w:type="dxa" w:w="2268"/>
             <w:shd w:fill="1B4F72" w:val="clear"/>
           </w:tcPr>
           <w:p>
@@ -1564,13 +1565,13 @@
                 <w:color w:val="FFFFFF"/>
                 <w:sz w:val="20"/>
               </w:rPr>
-              <w:t>Vai trò GCP</w:t>
-            </w:r>
-          </w:p>
-        </w:tc>
-        <w:tc>
-          <w:tcPr>
-            <w:tcW w:type="dxa" w:w="6236"/>
+              <w:t>Thành phần AI</w:t>
+            </w:r>
+          </w:p>
+        </w:tc>
+        <w:tc>
+          <w:tcPr>
+            <w:tcW w:type="dxa" w:w="2835"/>
             <w:shd w:fill="1B4F72" w:val="clear"/>
           </w:tcPr>
           <w:p>
@@ -1584,7 +1585,27 @@
                 <w:color w:val="FFFFFF"/>
                 <w:sz w:val="20"/>
               </w:rPr>
-              <w:t>Mục đích</w:t>
+              <w:t>Model</w:t>
+            </w:r>
+          </w:p>
+        </w:tc>
+        <w:tc>
+          <w:tcPr>
+            <w:tcW w:type="dxa" w:w="3969"/>
+            <w:shd w:fill="1B4F72" w:val="clear"/>
+          </w:tcPr>
+          <w:p>
+            <w:pPr>
+              <w:jc w:val="center"/>
+            </w:pPr>
+            <w:r/>
+            <w:r>
+              <w:rPr>
+                <w:b/>
+                <w:color w:val="FFFFFF"/>
+                <w:sz w:val="20"/>
+              </w:rPr>
+              <w:t>Mô tả</w:t>
             </w:r>
           </w:p>
         </w:tc>
@@ -1592,6 +1613,20 @@
       <w:tr>
         <w:tc>
           <w:tcPr>
+            <w:tcW w:type="dxa" w:w="2268"/>
+          </w:tcPr>
+          <w:p>
+            <w:r/>
+            <w:r>
+              <w:rPr>
+                <w:sz w:val="20"/>
+              </w:rPr>
+              <w:t>LLM (Large Language Model)</w:t>
+            </w:r>
+          </w:p>
+        </w:tc>
+        <w:tc>
+          <w:tcPr>
             <w:tcW w:type="dxa" w:w="2835"/>
           </w:tcPr>
           <w:p>
@@ -1600,21 +1635,21 @@
               <w:rPr>
                 <w:sz w:val="20"/>
               </w:rPr>
-              <w:t>Service Usage Consumer</w:t>
-            </w:r>
-          </w:p>
-        </w:tc>
-        <w:tc>
-          <w:tcPr>
-            <w:tcW w:type="dxa" w:w="6236"/>
-          </w:tcPr>
-          <w:p>
-            <w:r/>
-            <w:r>
-              <w:rPr>
-                <w:sz w:val="20"/>
-              </w:rPr>
-              <w:t>Cho phép gọi các API đã được bật trên project (Vertex AI API)</w:t>
+              <w:t>gemini/gemini-2.5-flash</w:t>
+            </w:r>
+          </w:p>
+        </w:tc>
+        <w:tc>
+          <w:tcPr>
+            <w:tcW w:type="dxa" w:w="3969"/>
+          </w:tcPr>
+          <w:p>
+            <w:r/>
+            <w:r>
+              <w:rPr>
+                <w:sz w:val="20"/>
+              </w:rPr>
+              <w:t>Chuyển câu hỏi tiếng Việt → SQL, tạo biểu đồ, phân tích</w:t>
             </w:r>
           </w:p>
         </w:tc>
@@ -1622,6 +1657,21 @@
       <w:tr>
         <w:tc>
           <w:tcPr>
+            <w:tcW w:type="dxa" w:w="2268"/>
+            <w:shd w:fill="F2F7FB" w:val="clear"/>
+          </w:tcPr>
+          <w:p>
+            <w:r/>
+            <w:r>
+              <w:rPr>
+                <w:sz w:val="20"/>
+              </w:rPr>
+              <w:t>Embedder</w:t>
+            </w:r>
+          </w:p>
+        </w:tc>
+        <w:tc>
+          <w:tcPr>
             <w:tcW w:type="dxa" w:w="2835"/>
             <w:shd w:fill="F2F7FB" w:val="clear"/>
           </w:tcPr>
@@ -1631,13 +1681,13 @@
               <w:rPr>
                 <w:sz w:val="20"/>
               </w:rPr>
-              <w:t>Vertex AI User</w:t>
-            </w:r>
-          </w:p>
-        </w:tc>
-        <w:tc>
-          <w:tcPr>
-            <w:tcW w:type="dxa" w:w="6236"/>
+              <w:t>gemini/gemini-embedding-001</w:t>
+            </w:r>
+          </w:p>
+        </w:tc>
+        <w:tc>
+          <w:tcPr>
+            <w:tcW w:type="dxa" w:w="3969"/>
             <w:shd w:fill="F2F7FB" w:val="clear"/>
           </w:tcPr>
           <w:p>
@@ -1646,7 +1696,7 @@
               <w:rPr>
                 <w:sz w:val="20"/>
               </w:rPr>
-              <w:t>Cho phép sử dụng Vertex AI services — gọi model Gemini qua Vertex AI</w:t>
+              <w:t>Tạo vector embeddings cho semantic search (768 dims)</w:t>
             </w:r>
           </w:p>
         </w:tc>
@@ -1654,30 +1704,25 @@
     </w:tbl>
     <w:p/>
     <w:p>
-      <w:r>
-        <w:t>Hệ thống sử dụng Vertex AI Authentication — xác thực bằng tài khoản Google Cloud thông qua lệnh gcloud auth. KHÔNG sử dụng API key. Mỗi thành viên chỉ cần đăng nhập bằng tài khoản @st.uel.edu.vn đã được cấp quyền trên GCP project.</w:t>
-      </w:r>
-    </w:p>
-    <w:p>
       <w:pPr>
         <w:spacing w:before="120" w:after="120"/>
         <w:ind w:left="283"/>
-        <w:shd w:fill="FFF3CD" w:val="clear"/>
+        <w:shd w:fill="D4EDDA" w:val="clear"/>
       </w:pPr>
       <w:r>
         <w:rPr>
           <w:b/>
-          <w:color w:val="856D0E"/>
+          <w:color w:val="155724"/>
           <w:sz w:val="20"/>
         </w:rPr>
-        <w:t xml:space="preserve">⚠ Cảnh báo: </w:t>
+        <w:t xml:space="preserve">✔ </w:t>
       </w:r>
       <w:r>
         <w:rPr>
-          <w:color w:val="856D0E"/>
+          <w:color w:val="155724"/>
           <w:sz w:val="20"/>
         </w:rPr>
-        <w:t>KHÔNG tạo Gemini API key. Hệ thống xác thực qua Vertex AI IAM — chỉ cần login bằng gcloud.</w:t>
+        <w:t>API key dùng chung cho cả team, đã được nhúng trong file .env. Không cần cài Google Cloud SDK hay gcloud.</w:t>
       </w:r>
     </w:p>
     <w:p>
@@ -3111,34 +3156,12 @@
         <w:pStyle w:val="Heading1"/>
       </w:pPr>
       <w:r>
-        <w:t>6. Cấu hình Vertex AI Authentication (Google Cloud)</w:t>
+        <w:t>6. Cấu hình môi trường (.env)</w:t>
       </w:r>
     </w:p>
     <w:p>
       <w:r>
-        <w:t>Hệ thống sử dụng Vertex AI Authentication — xác thực bằng tài khoản Google Cloud đã được cấp quyền IAM. KHÔNG cần tạo API key.</w:t>
-      </w:r>
-    </w:p>
-    <w:p>
-      <w:pPr>
-        <w:spacing w:before="120" w:after="120"/>
-        <w:ind w:left="283"/>
-        <w:shd w:fill="F8D7DA" w:val="clear"/>
-      </w:pPr>
-      <w:r>
-        <w:rPr>
-          <w:b/>
-          <w:color w:val="721C24"/>
-          <w:sz w:val="20"/>
-        </w:rPr>
-        <w:t xml:space="preserve">✘ </w:t>
-      </w:r>
-      <w:r>
-        <w:rPr>
-          <w:color w:val="721C24"/>
-          <w:sz w:val="20"/>
-        </w:rPr>
-        <w:t>KHÔNG tạo Gemini API key trên Google AI Studio. Việc tạo API key không cần thiết và có thể gây rủi ro bảo mật nếu bị lộ.</w:t>
+        <w:t>Hệ thống sử dụng Google Gemini API với API key đã được nhúng sẵn trong file .env. Thành viên chỉ cần pull code về là có thể chạy ngay — không cần cài Google Cloud SDK, không cần tạo API key riêng, không cần đăng nhập gcloud.</w:t>
       </w:r>
     </w:p>
     <w:p>
@@ -3160,7 +3183,7 @@
           <w:color w:val="155724"/>
           <w:sz w:val="20"/>
         </w:rPr>
-        <w:t>Chỉ cần đăng nhập bằng lệnh gcloud — tài khoản @st.uel.edu.vn đã được cấp quyền Vertex AI User trên GCP project.</w:t>
+        <w:t>API key dùng chung cho cả team. Dự án là GitLab private repo — chỉ thành viên được mời mới truy cập được.</w:t>
       </w:r>
     </w:p>
     <w:p>
@@ -3168,27 +3191,12 @@
         <w:pStyle w:val="Heading2"/>
       </w:pPr>
       <w:r>
-        <w:t>6.1. Cài đặt Google Cloud SDK</w:t>
+        <w:t>6.1. File .env đã có sẵn trong dự án</w:t>
       </w:r>
     </w:p>
     <w:p>
-      <w:pPr>
-        <w:spacing w:before="120"/>
-      </w:pPr>
-      <w:r>
-        <w:rPr>
-          <w:b/>
-          <w:color w:val="1B4F72"/>
-          <w:sz w:val="22"/>
-        </w:rPr>
-        <w:t xml:space="preserve">Bước 1: </w:t>
-      </w:r>
-      <w:r>
-        <w:rPr>
-          <w:b/>
-          <w:sz w:val="22"/>
-        </w:rPr>
-        <w:t>Tải Google Cloud SDK</w:t>
+      <w:r>
+        <w:t>Khi pull code từ GitLab, file .env đã được bao gồm sẵn với đầy đủ cấu hình. Bạn chỉ cần kiểm tra file tồn tại:</w:t>
       </w:r>
     </w:p>
     <w:p>
@@ -3203,424 +3211,27 @@
           <w:color w:val="2C3E50"/>
           <w:sz w:val="18"/>
         </w:rPr>
-        <w:t>https://cloud.google.com/sdk/docs/install</w:t>
+        <w:t>cd C:\Users\&lt;TenUser&gt;\hr-ai-project\WrenAI\docker</w:t>
+        <w:br/>
+        <w:br/>
+        <w:t># Kiểm tra file .env đã có</w:t>
+        <w:br/>
+        <w:t>Test-Path .env</w:t>
+        <w:br/>
+        <w:t># Kết quả mong đợi: True</w:t>
       </w:r>
     </w:p>
     <w:p>
       <w:pPr>
-        <w:spacing w:before="120"/>
-      </w:pPr>
-      <w:r>
-        <w:rPr>
-          <w:b/>
-          <w:color w:val="1B4F72"/>
-          <w:sz w:val="22"/>
-        </w:rPr>
-        <w:t xml:space="preserve">Bước 2: </w:t>
-      </w:r>
-      <w:r>
-        <w:rPr>
-          <w:b/>
-          <w:sz w:val="22"/>
-        </w:rPr>
-        <w:t>Chạy file cài đặt, làm theo hướng dẫn trên màn hình</w:t>
+        <w:pStyle w:val="Heading2"/>
+      </w:pPr>
+      <w:r>
+        <w:t>6.2. Nội dung quan trọng trong .env</w:t>
       </w:r>
     </w:p>
     <w:p>
-      <w:pPr>
-        <w:spacing w:before="120"/>
-      </w:pPr>
-      <w:r>
-        <w:rPr>
-          <w:b/>
-          <w:color w:val="1B4F72"/>
-          <w:sz w:val="22"/>
-        </w:rPr>
-        <w:t xml:space="preserve">Bước 3: </w:t>
-      </w:r>
-      <w:r>
-        <w:rPr>
-          <w:b/>
-          <w:sz w:val="22"/>
-        </w:rPr>
-        <w:t>Mở PowerShell mới và kiểm tra cài đặt thành công</w:t>
-      </w:r>
-    </w:p>
-    <w:p>
-      <w:pPr>
-        <w:spacing w:before="80" w:after="80"/>
-        <w:ind w:left="567"/>
-        <w:shd w:fill="F5F5F5" w:val="clear"/>
-      </w:pPr>
-      <w:r>
-        <w:rPr>
-          <w:rFonts w:ascii="Consolas" w:hAnsi="Consolas"/>
-          <w:color w:val="2C3E50"/>
-          <w:sz w:val="18"/>
-        </w:rPr>
-        <w:t>gcloud --version</w:t>
-        <w:br/>
-        <w:t># Kết quả mong đợi: Google Cloud SDK 5xx.x.x</w:t>
-      </w:r>
-    </w:p>
-    <w:p>
-      <w:pPr>
-        <w:pStyle w:val="Heading2"/>
-      </w:pPr>
-      <w:r>
-        <w:t>6.2. Đăng nhập Google Cloud</w:t>
-      </w:r>
-    </w:p>
-    <w:p>
-      <w:pPr>
-        <w:spacing w:before="120"/>
-      </w:pPr>
-      <w:r>
-        <w:rPr>
-          <w:b/>
-          <w:color w:val="1B4F72"/>
-          <w:sz w:val="22"/>
-        </w:rPr>
-        <w:t xml:space="preserve">Bước 1: </w:t>
-      </w:r>
-      <w:r>
-        <w:rPr>
-          <w:b/>
-          <w:sz w:val="22"/>
-        </w:rPr>
-        <w:t>Đăng nhập tài khoản Google Cloud</w:t>
-      </w:r>
-    </w:p>
-    <w:p>
-      <w:pPr>
-        <w:spacing w:before="80" w:after="80"/>
-        <w:ind w:left="567"/>
-        <w:shd w:fill="F5F5F5" w:val="clear"/>
-      </w:pPr>
-      <w:r>
-        <w:rPr>
-          <w:rFonts w:ascii="Consolas" w:hAnsi="Consolas"/>
-          <w:color w:val="2C3E50"/>
-          <w:sz w:val="18"/>
-        </w:rPr>
-        <w:t>gcloud auth login</w:t>
-      </w:r>
-    </w:p>
-    <w:p>
-      <w:r>
-        <w:t>Trình duyệt sẽ mở ra — đăng nhập bằng tài khoản @st.uel.edu.vn đã được cấp quyền.</w:t>
-      </w:r>
-    </w:p>
-    <w:p>
-      <w:pPr>
-        <w:spacing w:before="120"/>
-      </w:pPr>
-      <w:r>
-        <w:rPr>
-          <w:b/>
-          <w:color w:val="1B4F72"/>
-          <w:sz w:val="22"/>
-        </w:rPr>
-        <w:t xml:space="preserve">Bước 2: </w:t>
-      </w:r>
-      <w:r>
-        <w:rPr>
-          <w:b/>
-          <w:sz w:val="22"/>
-        </w:rPr>
-        <w:t>Đăng nhập Application Default Credentials (ADC) — dùng cho Docker</w:t>
-      </w:r>
-    </w:p>
-    <w:p>
-      <w:pPr>
-        <w:spacing w:before="80" w:after="80"/>
-        <w:ind w:left="567"/>
-        <w:shd w:fill="F5F5F5" w:val="clear"/>
-      </w:pPr>
-      <w:r>
-        <w:rPr>
-          <w:rFonts w:ascii="Consolas" w:hAnsi="Consolas"/>
-          <w:color w:val="2C3E50"/>
-          <w:sz w:val="18"/>
-        </w:rPr>
-        <w:t>gcloud auth application-default login</w:t>
-      </w:r>
-    </w:p>
-    <w:p>
-      <w:r>
-        <w:t>Trình duyệt sẽ mở ra lần nữa — đăng nhập cùng tài khoản. ADC credentials sẽ được lưu tại:</w:t>
-      </w:r>
-    </w:p>
-    <w:p>
-      <w:pPr>
-        <w:spacing w:before="80" w:after="80"/>
-        <w:ind w:left="567"/>
-        <w:shd w:fill="F5F5F5" w:val="clear"/>
-      </w:pPr>
-      <w:r>
-        <w:rPr>
-          <w:rFonts w:ascii="Consolas" w:hAnsi="Consolas"/>
-          <w:color w:val="2C3E50"/>
-          <w:sz w:val="18"/>
-        </w:rPr>
-        <w:t>C:\Users\&lt;TenUser&gt;\AppData\Roaming\gcloud\application_default_credentials.json</w:t>
-      </w:r>
-    </w:p>
-    <w:p>
-      <w:pPr>
-        <w:spacing w:before="120"/>
-      </w:pPr>
-      <w:r>
-        <w:rPr>
-          <w:b/>
-          <w:color w:val="1B4F72"/>
-          <w:sz w:val="22"/>
-        </w:rPr>
-        <w:t xml:space="preserve">Bước 3: </w:t>
-      </w:r>
-      <w:r>
-        <w:rPr>
-          <w:b/>
-          <w:sz w:val="22"/>
-        </w:rPr>
-        <w:t>Đặt quota project cho ADC</w:t>
-      </w:r>
-    </w:p>
-    <w:p>
-      <w:pPr>
-        <w:spacing w:before="80" w:after="80"/>
-        <w:ind w:left="567"/>
-        <w:shd w:fill="F5F5F5" w:val="clear"/>
-      </w:pPr>
-      <w:r>
-        <w:rPr>
-          <w:rFonts w:ascii="Consolas" w:hAnsi="Consolas"/>
-          <w:color w:val="2C3E50"/>
-          <w:sz w:val="18"/>
-        </w:rPr>
-        <w:t>gcloud auth application-default set-quota-project project-ba49e1b7-26e0-4cbf-a14</w:t>
-      </w:r>
-    </w:p>
-    <w:p>
-      <w:pPr>
-        <w:spacing w:before="120"/>
-      </w:pPr>
-      <w:r>
-        <w:rPr>
-          <w:b/>
-          <w:color w:val="1B4F72"/>
-          <w:sz w:val="22"/>
-        </w:rPr>
-        <w:t xml:space="preserve">Bước 4: </w:t>
-      </w:r>
-      <w:r>
-        <w:rPr>
-          <w:b/>
-          <w:sz w:val="22"/>
-        </w:rPr>
-        <w:t>Đặt project mặc định</w:t>
-      </w:r>
-    </w:p>
-    <w:p>
-      <w:pPr>
-        <w:spacing w:before="80" w:after="80"/>
-        <w:ind w:left="567"/>
-        <w:shd w:fill="F5F5F5" w:val="clear"/>
-      </w:pPr>
-      <w:r>
-        <w:rPr>
-          <w:rFonts w:ascii="Consolas" w:hAnsi="Consolas"/>
-          <w:color w:val="2C3E50"/>
-          <w:sz w:val="18"/>
-        </w:rPr>
-        <w:t>gcloud config set project project-ba49e1b7-26e0-4cbf-a14</w:t>
-      </w:r>
-    </w:p>
-    <w:p>
-      <w:pPr>
-        <w:pStyle w:val="Heading2"/>
-      </w:pPr>
-      <w:r>
-        <w:t>6.3. Copy ADC credentials cho Docker</w:t>
-      </w:r>
-    </w:p>
-    <w:p>
-      <w:pPr>
-        <w:spacing w:before="120"/>
-      </w:pPr>
-      <w:r>
-        <w:rPr>
-          <w:b/>
-          <w:color w:val="1B4F72"/>
-          <w:sz w:val="22"/>
-        </w:rPr>
-        <w:t xml:space="preserve">Bước 1: </w:t>
-      </w:r>
-      <w:r>
-        <w:rPr>
-          <w:b/>
-          <w:sz w:val="22"/>
-        </w:rPr>
-        <w:t>Tạo thư mục gcloud trong docker/</w:t>
-      </w:r>
-    </w:p>
-    <w:p>
-      <w:pPr>
-        <w:spacing w:before="80" w:after="80"/>
-        <w:ind w:left="567"/>
-        <w:shd w:fill="F5F5F5" w:val="clear"/>
-      </w:pPr>
-      <w:r>
-        <w:rPr>
-          <w:rFonts w:ascii="Consolas" w:hAnsi="Consolas"/>
-          <w:color w:val="2C3E50"/>
-          <w:sz w:val="18"/>
-        </w:rPr>
-        <w:t>cd C:\Users\&lt;TenUser&gt;\hr-ai-project\WrenAI\docker\</w:t>
-        <w:br/>
-        <w:t>New-Item -ItemType Directory -Path gcloud -Force</w:t>
-      </w:r>
-    </w:p>
-    <w:p>
-      <w:pPr>
-        <w:spacing w:before="120"/>
-      </w:pPr>
-      <w:r>
-        <w:rPr>
-          <w:b/>
-          <w:color w:val="1B4F72"/>
-          <w:sz w:val="22"/>
-        </w:rPr>
-        <w:t xml:space="preserve">Bước 2: </w:t>
-      </w:r>
-      <w:r>
-        <w:rPr>
-          <w:b/>
-          <w:sz w:val="22"/>
-        </w:rPr>
-        <w:t>Copy file ADC vào thư mục gcloud</w:t>
-      </w:r>
-    </w:p>
-    <w:p>
-      <w:pPr>
-        <w:spacing w:before="80" w:after="80"/>
-        <w:ind w:left="567"/>
-        <w:shd w:fill="F5F5F5" w:val="clear"/>
-      </w:pPr>
-      <w:r>
-        <w:rPr>
-          <w:rFonts w:ascii="Consolas" w:hAnsi="Consolas"/>
-          <w:color w:val="2C3E50"/>
-          <w:sz w:val="18"/>
-        </w:rPr>
-        <w:t>Copy-Item "$env:APPDATA\gcloud\application_default_credentials.json" .\gcloud\</w:t>
-      </w:r>
-    </w:p>
-    <w:p>
-      <w:pPr>
-        <w:spacing w:before="120" w:after="120"/>
-        <w:ind w:left="283"/>
-        <w:shd w:fill="D4EDDA" w:val="clear"/>
-      </w:pPr>
-      <w:r>
-        <w:rPr>
-          <w:b/>
-          <w:color w:val="155724"/>
-          <w:sz w:val="20"/>
-        </w:rPr>
-        <w:t xml:space="preserve">✔ </w:t>
-      </w:r>
-      <w:r>
-        <w:rPr>
-          <w:color w:val="155724"/>
-          <w:sz w:val="20"/>
-        </w:rPr>
-        <w:t>File này đã được thêm vào .gitignore — sẽ không bị commit lên Git.</w:t>
-      </w:r>
-    </w:p>
-    <w:p>
-      <w:pPr>
-        <w:pStyle w:val="Heading2"/>
-      </w:pPr>
-      <w:r>
-        <w:t>6.4. Tạo file .env</w:t>
-      </w:r>
-    </w:p>
-    <w:p>
-      <w:pPr>
-        <w:spacing w:before="120"/>
-      </w:pPr>
-      <w:r>
-        <w:rPr>
-          <w:b/>
-          <w:color w:val="1B4F72"/>
-          <w:sz w:val="22"/>
-        </w:rPr>
-        <w:t xml:space="preserve">Bước 1: </w:t>
-      </w:r>
-      <w:r>
-        <w:rPr>
-          <w:b/>
-          <w:sz w:val="22"/>
-        </w:rPr>
-        <w:t>Tạo file .env từ file mẫu</w:t>
-      </w:r>
-    </w:p>
-    <w:p>
-      <w:pPr>
-        <w:spacing w:before="80" w:after="80"/>
-        <w:ind w:left="567"/>
-        <w:shd w:fill="F5F5F5" w:val="clear"/>
-      </w:pPr>
-      <w:r>
-        <w:rPr>
-          <w:rFonts w:ascii="Consolas" w:hAnsi="Consolas"/>
-          <w:color w:val="2C3E50"/>
-          <w:sz w:val="18"/>
-        </w:rPr>
-        <w:t>cd C:\Users\&lt;TenUser&gt;\hr-ai-project\WrenAI\docker\</w:t>
-        <w:br/>
-        <w:t>Copy-Item .env.example .env</w:t>
-      </w:r>
-    </w:p>
-    <w:p>
-      <w:pPr>
-        <w:spacing w:before="120"/>
-      </w:pPr>
-      <w:r>
-        <w:rPr>
-          <w:b/>
-          <w:color w:val="1B4F72"/>
-          <w:sz w:val="22"/>
-        </w:rPr>
-        <w:t xml:space="preserve">Bước 2: </w:t>
-      </w:r>
-      <w:r>
-        <w:rPr>
-          <w:b/>
-          <w:sz w:val="22"/>
-        </w:rPr>
-        <w:t>Mở file .env và chỉnh sửa</w:t>
-      </w:r>
-    </w:p>
-    <w:p>
-      <w:pPr>
-        <w:spacing w:before="80" w:after="80"/>
-        <w:ind w:left="567"/>
-        <w:shd w:fill="F5F5F5" w:val="clear"/>
-      </w:pPr>
-      <w:r>
-        <w:rPr>
-          <w:rFonts w:ascii="Consolas" w:hAnsi="Consolas"/>
-          <w:color w:val="2C3E50"/>
-          <w:sz w:val="18"/>
-        </w:rPr>
-        <w:t>code .env</w:t>
-      </w:r>
-    </w:p>
-    <w:p>
-      <w:r>
-        <w:t>Chỉnh sửa các giá trị sau trong file .env:</w:t>
+      <w:r>
+        <w:t>File .env chứa các biến cấu hình sau (đã được thiết lập sẵn):</w:t>
       </w:r>
     </w:p>
     <w:tbl>
@@ -3708,7 +3319,7 @@
               <w:rPr>
                 <w:sz w:val="20"/>
               </w:rPr>
-              <w:t>COMPOSE_PROJECT_NAME</w:t>
+              <w:t>GEMINI_API_KEY</w:t>
             </w:r>
           </w:p>
         </w:tc>
@@ -3722,7 +3333,7 @@
               <w:rPr>
                 <w:sz w:val="20"/>
               </w:rPr>
-              <w:t>wrenai</w:t>
+              <w:t>(đã nhúng sẵn)</w:t>
             </w:r>
           </w:p>
         </w:tc>
@@ -3736,7 +3347,7 @@
               <w:rPr>
                 <w:sz w:val="20"/>
               </w:rPr>
-              <w:t>Tên Docker project (giữ nguyên)</w:t>
+              <w:t>API key Google Gemini — dùng chung cho team</w:t>
             </w:r>
           </w:p>
         </w:tc>
@@ -3753,7 +3364,7 @@
               <w:rPr>
                 <w:sz w:val="20"/>
               </w:rPr>
-              <w:t>VERTEXAI_PROJECT</w:t>
+              <w:t>GENERATION_MODEL</w:t>
             </w:r>
           </w:p>
         </w:tc>
@@ -3768,7 +3379,7 @@
               <w:rPr>
                 <w:sz w:val="20"/>
               </w:rPr>
-              <w:t>project-ba49e1b7-26e0-4cbf-a14</w:t>
+              <w:t>gemini/gemini-2.5-flash</w:t>
             </w:r>
           </w:p>
         </w:tc>
@@ -3783,7 +3394,7 @@
               <w:rPr>
                 <w:sz w:val="20"/>
               </w:rPr>
-              <w:t>GCP Project ID đã được cấp quyền</w:t>
+              <w:t>Model LLM sử dụng</w:t>
             </w:r>
           </w:p>
         </w:tc>
@@ -3799,7 +3410,7 @@
               <w:rPr>
                 <w:sz w:val="20"/>
               </w:rPr>
-              <w:t>VERTEXAI_LOCATION</w:t>
+              <w:t>COMPOSE_PROJECT_NAME</w:t>
             </w:r>
           </w:p>
         </w:tc>
@@ -3813,7 +3424,7 @@
               <w:rPr>
                 <w:sz w:val="20"/>
               </w:rPr>
-              <w:t>us-central1</w:t>
+              <w:t>wrenai</w:t>
             </w:r>
           </w:p>
         </w:tc>
@@ -3827,7 +3438,7 @@
               <w:rPr>
                 <w:sz w:val="20"/>
               </w:rPr>
-              <w:t>Vùng Vertex AI</w:t>
+              <w:t>Tên Docker project</w:t>
             </w:r>
           </w:p>
         </w:tc>
@@ -3844,7 +3455,7 @@
               <w:rPr>
                 <w:sz w:val="20"/>
               </w:rPr>
-              <w:t>GENERATION_MODEL</w:t>
+              <w:t>SHOULD_FORCE_DEPLOY</w:t>
             </w:r>
           </w:p>
         </w:tc>
@@ -3859,7 +3470,7 @@
               <w:rPr>
                 <w:sz w:val="20"/>
               </w:rPr>
-              <w:t>vertex_ai/gemini-2.5-flash</w:t>
+              <w:t>1</w:t>
             </w:r>
           </w:p>
         </w:tc>
@@ -3874,7 +3485,7 @@
               <w:rPr>
                 <w:sz w:val="20"/>
               </w:rPr>
-              <w:t>Model AI sử dụng</w:t>
+              <w:t>Tự động deploy model khi khởi động</w:t>
             </w:r>
           </w:p>
         </w:tc>
@@ -3904,7 +3515,7 @@
               <w:rPr>
                 <w:sz w:val="20"/>
               </w:rPr>
-              <w:t>(tạo UUID mới)</w:t>
+              <w:t>(đã có sẵn)</w:t>
             </w:r>
           </w:p>
         </w:tc>
@@ -3918,74 +3529,13 @@
               <w:rPr>
                 <w:sz w:val="20"/>
               </w:rPr>
-              <w:t>Chạy lệnh bên dưới để tạo</w:t>
+              <w:t>UUID người dùng — giữ nguyên</w:t>
             </w:r>
           </w:p>
         </w:tc>
       </w:tr>
     </w:tbl>
     <w:p/>
-    <w:p>
-      <w:r>
-        <w:t>Tạo UUID ngẫu nhiên bằng PowerShell:</w:t>
-      </w:r>
-    </w:p>
-    <w:p>
-      <w:pPr>
-        <w:spacing w:before="80" w:after="80"/>
-        <w:ind w:left="567"/>
-        <w:shd w:fill="F5F5F5" w:val="clear"/>
-      </w:pPr>
-      <w:r>
-        <w:rPr>
-          <w:rFonts w:ascii="Consolas" w:hAnsi="Consolas"/>
-          <w:color w:val="2C3E50"/>
-          <w:sz w:val="18"/>
-        </w:rPr>
-        <w:t>[guid]::NewGuid().ToString()</w:t>
-        <w:br/>
-        <w:t># Kết quả ví dụ: a1b2c3d4-e5f6-7890-abcd-ef1234567890</w:t>
-        <w:br/>
-        <w:t># Dán giá trị này vào dòng USER_UUID= trong file .env</w:t>
-      </w:r>
-    </w:p>
-    <w:p>
-      <w:pPr>
-        <w:pStyle w:val="Heading2"/>
-      </w:pPr>
-      <w:r>
-        <w:t>6.5. Kiểm tra cấu hình</w:t>
-      </w:r>
-    </w:p>
-    <w:p>
-      <w:pPr>
-        <w:spacing w:before="80" w:after="80"/>
-        <w:ind w:left="567"/>
-        <w:shd w:fill="F5F5F5" w:val="clear"/>
-      </w:pPr>
-      <w:r>
-        <w:rPr>
-          <w:rFonts w:ascii="Consolas" w:hAnsi="Consolas"/>
-          <w:color w:val="2C3E50"/>
-          <w:sz w:val="18"/>
-        </w:rPr>
-        <w:t># Kiểm tra file .env</w:t>
-        <w:br/>
-        <w:t>Select-String -Path .env -Pattern "VERTEXAI_PROJECT|USER_UUID|COMPOSE_PROJECT_NAME"</w:t>
-        <w:br/>
-        <w:br/>
-        <w:t># Kiểm tra file ADC đã copy</w:t>
-        <w:br/>
-        <w:t>Test-Path .\gcloud\application_default_credentials.json</w:t>
-        <w:br/>
-        <w:t># Kết quả mong đợi: True</w:t>
-      </w:r>
-    </w:p>
-    <w:p>
-      <w:r>
-        <w:t>Kết quả mong đợi: 3 dòng với giá trị thực tế và file ADC tồn tại.</w:t>
-      </w:r>
-    </w:p>
     <w:p>
       <w:pPr>
         <w:spacing w:before="120" w:after="120"/>
@@ -4005,7 +3555,246 @@
           <w:color w:val="856D0E"/>
           <w:sz w:val="20"/>
         </w:rPr>
-        <w:t>File .env và thư mục gcloud/ đã được thêm vào .gitignore. Chúng sẽ không bao giờ bị commit lên Git.</w:t>
+        <w:t>Không thay đổi GEMINI_API_KEY trong file .env trừ khi được hướng dẫn bởi Lead.</w:t>
+      </w:r>
+    </w:p>
+    <w:p>
+      <w:pPr>
+        <w:pStyle w:val="Heading2"/>
+      </w:pPr>
+      <w:r>
+        <w:t>6.3. Cấu hình AI models (config.yaml)</w:t>
+      </w:r>
+    </w:p>
+    <w:p>
+      <w:r>
+        <w:t>File config.yaml cũng đã có sẵn, cấu hình 2 model AI:</w:t>
+      </w:r>
+    </w:p>
+    <w:tbl>
+      <w:tblPr>
+        <w:tblStyle w:val="TableGrid"/>
+        <w:tblW w:type="auto" w:w="0"/>
+        <w:jc w:val="center"/>
+        <w:tblLook w:firstColumn="1" w:firstRow="1" w:lastColumn="0" w:lastRow="0" w:noHBand="0" w:noVBand="1" w:val="04A0"/>
+      </w:tblPr>
+      <w:tblGrid>
+        <w:gridCol w:w="3041"/>
+        <w:gridCol w:w="3041"/>
+        <w:gridCol w:w="3041"/>
+      </w:tblGrid>
+      <w:tr>
+        <w:tc>
+          <w:tcPr>
+            <w:tcW w:type="dxa" w:w="1701"/>
+            <w:shd w:fill="1B4F72" w:val="clear"/>
+          </w:tcPr>
+          <w:p>
+            <w:pPr>
+              <w:jc w:val="center"/>
+            </w:pPr>
+            <w:r/>
+            <w:r>
+              <w:rPr>
+                <w:b/>
+                <w:color w:val="FFFFFF"/>
+                <w:sz w:val="20"/>
+              </w:rPr>
+              <w:t>Thành phần</w:t>
+            </w:r>
+          </w:p>
+        </w:tc>
+        <w:tc>
+          <w:tcPr>
+            <w:tcW w:type="dxa" w:w="2835"/>
+            <w:shd w:fill="1B4F72" w:val="clear"/>
+          </w:tcPr>
+          <w:p>
+            <w:pPr>
+              <w:jc w:val="center"/>
+            </w:pPr>
+            <w:r/>
+            <w:r>
+              <w:rPr>
+                <w:b/>
+                <w:color w:val="FFFFFF"/>
+                <w:sz w:val="20"/>
+              </w:rPr>
+              <w:t>Model</w:t>
+            </w:r>
+          </w:p>
+        </w:tc>
+        <w:tc>
+          <w:tcPr>
+            <w:tcW w:type="dxa" w:w="4535"/>
+            <w:shd w:fill="1B4F72" w:val="clear"/>
+          </w:tcPr>
+          <w:p>
+            <w:pPr>
+              <w:jc w:val="center"/>
+            </w:pPr>
+            <w:r/>
+            <w:r>
+              <w:rPr>
+                <w:b/>
+                <w:color w:val="FFFFFF"/>
+                <w:sz w:val="20"/>
+              </w:rPr>
+              <w:t>Vai trò</w:t>
+            </w:r>
+          </w:p>
+        </w:tc>
+      </w:tr>
+      <w:tr>
+        <w:tc>
+          <w:tcPr>
+            <w:tcW w:type="dxa" w:w="1701"/>
+          </w:tcPr>
+          <w:p>
+            <w:r/>
+            <w:r>
+              <w:rPr>
+                <w:sz w:val="20"/>
+              </w:rPr>
+              <w:t>LLM</w:t>
+            </w:r>
+          </w:p>
+        </w:tc>
+        <w:tc>
+          <w:tcPr>
+            <w:tcW w:type="dxa" w:w="2835"/>
+          </w:tcPr>
+          <w:p>
+            <w:r/>
+            <w:r>
+              <w:rPr>
+                <w:sz w:val="20"/>
+              </w:rPr>
+              <w:t>gemini/gemini-2.5-flash</w:t>
+            </w:r>
+          </w:p>
+        </w:tc>
+        <w:tc>
+          <w:tcPr>
+            <w:tcW w:type="dxa" w:w="4535"/>
+          </w:tcPr>
+          <w:p>
+            <w:r/>
+            <w:r>
+              <w:rPr>
+                <w:sz w:val="20"/>
+              </w:rPr>
+              <w:t>Hiểu câu hỏi tiếng Việt, tạo SQL, phân tích kết quả</w:t>
+            </w:r>
+          </w:p>
+        </w:tc>
+      </w:tr>
+      <w:tr>
+        <w:tc>
+          <w:tcPr>
+            <w:tcW w:type="dxa" w:w="1701"/>
+            <w:shd w:fill="F2F7FB" w:val="clear"/>
+          </w:tcPr>
+          <w:p>
+            <w:r/>
+            <w:r>
+              <w:rPr>
+                <w:sz w:val="20"/>
+              </w:rPr>
+              <w:t>Embedder</w:t>
+            </w:r>
+          </w:p>
+        </w:tc>
+        <w:tc>
+          <w:tcPr>
+            <w:tcW w:type="dxa" w:w="2835"/>
+            <w:shd w:fill="F2F7FB" w:val="clear"/>
+          </w:tcPr>
+          <w:p>
+            <w:r/>
+            <w:r>
+              <w:rPr>
+                <w:sz w:val="20"/>
+              </w:rPr>
+              <w:t>gemini/gemini-embedding-001</w:t>
+            </w:r>
+          </w:p>
+        </w:tc>
+        <w:tc>
+          <w:tcPr>
+            <w:tcW w:type="dxa" w:w="4535"/>
+            <w:shd w:fill="F2F7FB" w:val="clear"/>
+          </w:tcPr>
+          <w:p>
+            <w:r/>
+            <w:r>
+              <w:rPr>
+                <w:sz w:val="20"/>
+              </w:rPr>
+              <w:t>Tạo vector embeddings cho semantic search (768 dims)</w:t>
+            </w:r>
+          </w:p>
+        </w:tc>
+      </w:tr>
+    </w:tbl>
+    <w:p/>
+    <w:p>
+      <w:pPr>
+        <w:spacing w:before="120" w:after="120"/>
+        <w:ind w:left="283"/>
+        <w:shd w:fill="D4EDDA" w:val="clear"/>
+      </w:pPr>
+      <w:r>
+        <w:rPr>
+          <w:b/>
+          <w:color w:val="155724"/>
+          <w:sz w:val="20"/>
+        </w:rPr>
+        <w:t xml:space="preserve">✔ </w:t>
+      </w:r>
+      <w:r>
+        <w:rPr>
+          <w:color w:val="155724"/>
+          <w:sz w:val="20"/>
+        </w:rPr>
+        <w:t>Không cần chỉnh sửa config.yaml. Mọi cấu hình đã sẵn sàng sau khi pull code.</w:t>
+      </w:r>
+    </w:p>
+    <w:p>
+      <w:pPr>
+        <w:pStyle w:val="Heading2"/>
+      </w:pPr>
+      <w:r>
+        <w:t>6.4. Kiểm tra cấu hình</w:t>
+      </w:r>
+    </w:p>
+    <w:p>
+      <w:pPr>
+        <w:spacing w:before="80" w:after="80"/>
+        <w:ind w:left="567"/>
+        <w:shd w:fill="F5F5F5" w:val="clear"/>
+      </w:pPr>
+      <w:r>
+        <w:rPr>
+          <w:rFonts w:ascii="Consolas" w:hAnsi="Consolas"/>
+          <w:color w:val="2C3E50"/>
+          <w:sz w:val="18"/>
+        </w:rPr>
+        <w:t># Kiểm tra file .env có tồn tại và đầy đủ</w:t>
+        <w:br/>
+        <w:t>Select-String -Path .env -Pattern "GEMINI_API_KEY|GENERATION_MODEL|USER_UUID"</w:t>
+        <w:br/>
+        <w:br/>
+        <w:t># Kiểm tra config.yaml</w:t>
+        <w:br/>
+        <w:t>Test-Path config.yaml</w:t>
+        <w:br/>
+        <w:t># Kết quả mong đợi: True</w:t>
+      </w:r>
+    </w:p>
+    <w:p>
+      <w:r>
+        <w:t>Kết quả mong đợi: 3 dòng với giá trị thực tế và config.yaml tồn tại.</w:t>
       </w:r>
     </w:p>
     <w:p>
@@ -5926,9 +5715,9 @@
         <w:br/>
         <w:t>│   └── docker/</w:t>
         <w:br/>
-        <w:t>│       ├── .env.example                ← File mẫu để tạo .env</w:t>
+        <w:t>│       ├── .env                        ← Cấu hình + API key (đã commit)</w:t>
         <w:br/>
-        <w:t>│       ├── .env                        ← File bí mật (không commit)</w:t>
+        <w:t>│       ├── .env.example                ← File mẫu tham khảo</w:t>
         <w:br/>
         <w:t>│       ├── config.yaml                 ← Cấu hình LLM và Embedder</w:t>
         <w:br/>
@@ -6064,7 +5853,7 @@
               <w:rPr>
                 <w:sz w:val="20"/>
               </w:rPr>
-              <w:t>⚠ Bí mật</w:t>
+              <w:t>Cấu hình</w:t>
             </w:r>
           </w:p>
         </w:tc>
@@ -6078,7 +5867,7 @@
               <w:rPr>
                 <w:sz w:val="20"/>
               </w:rPr>
-              <w:t>Chứa API keys — không được commit</w:t>
+              <w:t>Chứa GEMINI_API_KEY — đã commit trong private repo</w:t>
             </w:r>
           </w:p>
         </w:tc>
@@ -6125,7 +5914,7 @@
               <w:rPr>
                 <w:sz w:val="20"/>
               </w:rPr>
-              <w:t>Mẫu để tạo file .env</w:t>
+              <w:t>Mẫu file .env với API key nhúng sẵn</w:t>
             </w:r>
           </w:p>
         </w:tc>
@@ -6216,7 +6005,7 @@
               <w:rPr>
                 <w:sz w:val="20"/>
               </w:rPr>
-              <w:t>Model AI (Vertex AI/Gemini), embedder, pipelines</w:t>
+              <w:t>Model AI (Gemini 2.5 Flash), embedder (Gemini Embedding 001), pipelines</w:t>
             </w:r>
           </w:p>
         </w:tc>
@@ -6402,7 +6191,7 @@
         <w:pStyle w:val="Heading2"/>
       </w:pPr>
       <w:r>
-        <w:t>12.3. Lỗi: AI Service trả về lỗi xác thực Vertex AI</w:t>
+        <w:t>12.3. Lỗi: AI Service trả về lỗi xác thực API</w:t>
       </w:r>
     </w:p>
     <w:p>
@@ -6417,7 +6206,7 @@
         <w:rPr>
           <w:sz w:val="22"/>
         </w:rPr>
-        <w:t>ADC credentials chưa được cấu hình hoặc hết hạn.</w:t>
+        <w:t>GEMINI_API_KEY trong file .env bị thiếu, sai, hoặc đã hết quota.</w:t>
       </w:r>
     </w:p>
     <w:p>
@@ -6441,19 +6230,11 @@
           <w:color w:val="2C3E50"/>
           <w:sz w:val="18"/>
         </w:rPr>
-        <w:t># Đăng nhập lại ADC</w:t>
+        <w:t># Kiểm tra API key trong .env</w:t>
         <w:br/>
-        <w:t>gcloud auth application-default login</w:t>
+        <w:t>Select-String -Path .env -Pattern "GEMINI_API_KEY"</w:t>
         <w:br/>
-        <w:br/>
-        <w:t># Đặt lại quota project</w:t>
-        <w:br/>
-        <w:t>gcloud auth application-default set-quota-project project-ba49e1b7-26e0-4cbf-a14</w:t>
-        <w:br/>
-        <w:br/>
-        <w:t># Copy lại file ADC</w:t>
-        <w:br/>
-        <w:t>Copy-Item "$env:APPDATA\gcloud\application_default_credentials.json" .\gcloud\</w:t>
+        <w:t># Đảm bảo có giá trị: GEMINI_API_KEY=AIzaSy...</w:t>
         <w:br/>
         <w:br/>
         <w:t># Khởi động lại:</w:t>
@@ -6463,6 +6244,9 @@
         <w:t>docker compose down</w:t>
         <w:br/>
         <w:t>docker compose up -d</w:t>
+        <w:br/>
+        <w:br/>
+        <w:t># Nếu vẫn lỗi, liên hệ Lead để kiểm tra API key</w:t>
       </w:r>
     </w:p>
     <w:p>
@@ -6539,7 +6323,7 @@
         <w:rPr>
           <w:sz w:val="22"/>
         </w:rPr>
-        <w:t>ADC credentials thiếu/sai, hoặc config.yaml bị lỗi cấu trúc.</w:t>
+        <w:t>GEMINI_API_KEY thiếu/sai, hoặc config.yaml bị lỗi cấu trúc.</w:t>
       </w:r>
     </w:p>
     <w:p>
@@ -6568,14 +6352,14 @@
         <w:t>docker logs wrenai-wren-ai-service-1 --tail 50</w:t>
         <w:br/>
         <w:br/>
-        <w:t># Kiểm tra ADC file</w:t>
+        <w:t># Kiểm tra .env có GEMINI_API_KEY</w:t>
         <w:br/>
-        <w:t>Test-Path WrenAI\docker\gcloud\application_default_credentials.json</w:t>
+        <w:t>Select-String -Path WrenAI\docker\.env -Pattern "GEMINI_API_KEY"</w:t>
         <w:br/>
         <w:br/>
-        <w:t># Kiểm tra .env</w:t>
+        <w:t># Kiểm tra config.yaml tồn tại</w:t>
         <w:br/>
-        <w:t>Select-String -Path WrenAI\docker\.env -Pattern "VERTEXAI_PROJECT"</w:t>
+        <w:t>Test-Path WrenAI\docker\config.yaml</w:t>
         <w:br/>
         <w:br/>
         <w:t># Khởi động lại</w:t>
@@ -6659,307 +6443,12 @@
         <w:pStyle w:val="Heading2"/>
       </w:pPr>
       <w:r>
-        <w:t>13.1. Không bao giờ commit các file sau lên Git</w:t>
-      </w:r>
-    </w:p>
-    <w:tbl>
-      <w:tblPr>
-        <w:tblStyle w:val="TableGrid"/>
-        <w:tblW w:type="auto" w:w="0"/>
-        <w:jc w:val="center"/>
-        <w:tblLook w:firstColumn="1" w:firstRow="1" w:lastColumn="0" w:lastRow="0" w:noHBand="0" w:noVBand="1" w:val="04A0"/>
-      </w:tblPr>
-      <w:tblGrid>
-        <w:gridCol w:w="4561"/>
-        <w:gridCol w:w="4561"/>
-      </w:tblGrid>
-      <w:tr>
-        <w:tc>
-          <w:tcPr>
-            <w:tcW w:type="dxa" w:w="3969"/>
-            <w:shd w:fill="1B4F72" w:val="clear"/>
-          </w:tcPr>
-          <w:p>
-            <w:pPr>
-              <w:jc w:val="center"/>
-            </w:pPr>
-            <w:r/>
-            <w:r>
-              <w:rPr>
-                <w:b/>
-                <w:color w:val="FFFFFF"/>
-                <w:sz w:val="20"/>
-              </w:rPr>
-              <w:t>File</w:t>
-            </w:r>
-          </w:p>
-        </w:tc>
-        <w:tc>
-          <w:tcPr>
-            <w:tcW w:type="dxa" w:w="5102"/>
-            <w:shd w:fill="1B4F72" w:val="clear"/>
-          </w:tcPr>
-          <w:p>
-            <w:pPr>
-              <w:jc w:val="center"/>
-            </w:pPr>
-            <w:r/>
-            <w:r>
-              <w:rPr>
-                <w:b/>
-                <w:color w:val="FFFFFF"/>
-                <w:sz w:val="20"/>
-              </w:rPr>
-              <w:t>Lý do</w:t>
-            </w:r>
-          </w:p>
-        </w:tc>
-      </w:tr>
-      <w:tr>
-        <w:tc>
-          <w:tcPr>
-            <w:tcW w:type="dxa" w:w="3969"/>
-          </w:tcPr>
-          <w:p>
-            <w:r/>
-            <w:r>
-              <w:rPr>
-                <w:sz w:val="20"/>
-              </w:rPr>
-              <w:t>.env</w:t>
-            </w:r>
-          </w:p>
-        </w:tc>
-        <w:tc>
-          <w:tcPr>
-            <w:tcW w:type="dxa" w:w="5102"/>
-          </w:tcPr>
-          <w:p>
-            <w:r/>
-            <w:r>
-              <w:rPr>
-                <w:sz w:val="20"/>
-              </w:rPr>
-              <w:t>Chứa API key và mật khẩu</w:t>
-            </w:r>
-          </w:p>
-        </w:tc>
-      </w:tr>
-      <w:tr>
-        <w:tc>
-          <w:tcPr>
-            <w:tcW w:type="dxa" w:w="3969"/>
-            <w:shd w:fill="F2F7FB" w:val="clear"/>
-          </w:tcPr>
-          <w:p>
-            <w:r/>
-            <w:r>
-              <w:rPr>
-                <w:sz w:val="20"/>
-              </w:rPr>
-              <w:t>application_default_credentials.json</w:t>
-            </w:r>
-          </w:p>
-        </w:tc>
-        <w:tc>
-          <w:tcPr>
-            <w:tcW w:type="dxa" w:w="5102"/>
-            <w:shd w:fill="F2F7FB" w:val="clear"/>
-          </w:tcPr>
-          <w:p>
-            <w:r/>
-            <w:r>
-              <w:rPr>
-                <w:sz w:val="20"/>
-              </w:rPr>
-              <w:t>Chứa credential Google Cloud</w:t>
-            </w:r>
-          </w:p>
-        </w:tc>
-      </w:tr>
-      <w:tr>
-        <w:tc>
-          <w:tcPr>
-            <w:tcW w:type="dxa" w:w="3969"/>
-          </w:tcPr>
-          <w:p>
-            <w:r/>
-            <w:r>
-              <w:rPr>
-                <w:sz w:val="20"/>
-              </w:rPr>
-              <w:t>service-account*.json</w:t>
-            </w:r>
-          </w:p>
-        </w:tc>
-        <w:tc>
-          <w:tcPr>
-            <w:tcW w:type="dxa" w:w="5102"/>
-          </w:tcPr>
-          <w:p>
-            <w:r/>
-            <w:r>
-              <w:rPr>
-                <w:sz w:val="20"/>
-              </w:rPr>
-              <w:t>Chứa khóa tài khoản dịch vụ</w:t>
-            </w:r>
-          </w:p>
-        </w:tc>
-      </w:tr>
-      <w:tr>
-        <w:tc>
-          <w:tcPr>
-            <w:tcW w:type="dxa" w:w="3969"/>
-            <w:shd w:fill="F2F7FB" w:val="clear"/>
-          </w:tcPr>
-          <w:p>
-            <w:r/>
-            <w:r>
-              <w:rPr>
-                <w:sz w:val="20"/>
-              </w:rPr>
-              <w:t>File chứa mật khẩu SQL Server</w:t>
-            </w:r>
-          </w:p>
-        </w:tc>
-        <w:tc>
-          <w:tcPr>
-            <w:tcW w:type="dxa" w:w="5102"/>
-            <w:shd w:fill="F2F7FB" w:val="clear"/>
-          </w:tcPr>
-          <w:p>
-            <w:r/>
-            <w:r>
-              <w:rPr>
-                <w:sz w:val="20"/>
-              </w:rPr>
-              <w:t>Bảo vệ truy cập database</w:t>
-            </w:r>
-          </w:p>
-        </w:tc>
-      </w:tr>
-    </w:tbl>
-    <w:p/>
-    <w:p>
-      <w:pPr>
-        <w:pStyle w:val="Heading2"/>
-      </w:pPr>
-      <w:r>
-        <w:t>13.2. Kiểm tra trước khi commit</w:t>
+        <w:t>13.1. Các file nhạy cảm và quy tắc</w:t>
       </w:r>
     </w:p>
     <w:p>
-      <w:pPr>
-        <w:spacing w:before="80" w:after="80"/>
-        <w:ind w:left="567"/>
-        <w:shd w:fill="F5F5F5" w:val="clear"/>
-      </w:pPr>
-      <w:r>
-        <w:rPr>
-          <w:rFonts w:ascii="Consolas" w:hAnsi="Consolas"/>
-          <w:color w:val="2C3E50"/>
-          <w:sz w:val="18"/>
-        </w:rPr>
-        <w:t># Luôn kiểm tra trước khi commit</w:t>
-        <w:br/>
-        <w:t>git status</w:t>
-        <w:br/>
-        <w:br/>
-        <w:t># Đảm bảo không có file nào tên .env trong danh sách</w:t>
-        <w:br/>
-        <w:t># Nếu thấy .env, dừng lại và liên hệ quản trị viên</w:t>
-      </w:r>
-    </w:p>
-    <w:p>
-      <w:pPr>
-        <w:pStyle w:val="Heading2"/>
-      </w:pPr>
-      <w:r>
-        <w:t>13.3. Nếu lỡ commit file bí mật</w:t>
-      </w:r>
-    </w:p>
-    <w:p>
-      <w:pPr>
-        <w:spacing w:before="80" w:after="80"/>
-        <w:ind w:left="567"/>
-        <w:shd w:fill="F5F5F5" w:val="clear"/>
-      </w:pPr>
-      <w:r>
-        <w:rPr>
-          <w:rFonts w:ascii="Consolas" w:hAnsi="Consolas"/>
-          <w:color w:val="2C3E50"/>
-          <w:sz w:val="18"/>
-        </w:rPr>
-        <w:t># Xóa file khỏi Git (giữ file trên máy)</w:t>
-        <w:br/>
-        <w:t>git rm --cached WrenAI/docker/.env</w:t>
-        <w:br/>
-        <w:t>git rm --cached WrenAI/docker/gcloud/application_default_credentials.json</w:t>
-        <w:br/>
-        <w:t>git commit -m "fix: xóa file credentials khỏi git"</w:t>
-        <w:br/>
-        <w:t>git push origin hr_domain_research</w:t>
-        <w:br/>
-        <w:br/>
-        <w:t># Sau đó: revoke và tạo lại ADC</w:t>
-        <w:br/>
-        <w:t>gcloud auth application-default revoke</w:t>
-        <w:br/>
-        <w:t>gcloud auth application-default login</w:t>
-      </w:r>
-    </w:p>
-    <w:p>
-      <w:pPr>
-        <w:pStyle w:val="Heading2"/>
-      </w:pPr>
-      <w:r>
-        <w:t>13.4. Bảo vệ credentials Google Cloud</w:t>
-      </w:r>
-    </w:p>
-    <w:p>
-      <w:r>
-        <w:t>File application_default_credentials.json chứa token xác thực Google Cloud cá nhân. Không chia sẻ file này, không gửi qua chat/email. Mỗi thành viên tự tạo ADC riêng bằng lệnh gcloud auth application-default login.</w:t>
-      </w:r>
-    </w:p>
-    <w:p>
-      <w:pPr>
-        <w:spacing w:before="120" w:after="120"/>
-        <w:ind w:left="283"/>
-        <w:shd w:fill="F8D7DA" w:val="clear"/>
-      </w:pPr>
-      <w:r>
-        <w:rPr>
-          <w:b/>
-          <w:color w:val="721C24"/>
-          <w:sz w:val="20"/>
-        </w:rPr>
-        <w:t xml:space="preserve">✘ </w:t>
-      </w:r>
-      <w:r>
-        <w:rPr>
-          <w:color w:val="721C24"/>
-          <w:sz w:val="20"/>
-        </w:rPr>
-        <w:t>KHÔNG tạo Gemini API key. Hệ thống xác thực qua Vertex AI IAM — chỉ cần login bằng gcloud.</w:t>
-      </w:r>
-    </w:p>
-    <w:p>
-      <w:r>
-        <w:br w:type="page"/>
-      </w:r>
-    </w:p>
-    <w:p>
-      <w:pPr>
-        <w:pStyle w:val="Heading1"/>
-      </w:pPr>
-      <w:r>
-        <w:t>14. Bảng kiểm (checklist) onboarding</w:t>
-      </w:r>
-    </w:p>
-    <w:p>
-      <w:r>
-        <w:t>Đánh dấu ✓ khi hoàn thành từng bước:</w:t>
+      <w:r>
+        <w:t>File .env chứa Gemini API key đã được commit vào GitLab private repo để team pull về và chạy ngay. Điều này an toàn vì repo là private — chỉ thành viên được mời mới truy cập được.</w:t>
       </w:r>
     </w:p>
     <w:tbl>
@@ -6977,7 +6466,7 @@
       <w:tr>
         <w:tc>
           <w:tcPr>
-            <w:tcW w:type="dxa" w:w="850"/>
+            <w:tcW w:type="dxa" w:w="2835"/>
             <w:shd w:fill="1B4F72" w:val="clear"/>
           </w:tcPr>
           <w:p>
@@ -6991,13 +6480,13 @@
                 <w:color w:val="FFFFFF"/>
                 <w:sz w:val="20"/>
               </w:rPr>
-              <w:t>STT</w:t>
-            </w:r>
-          </w:p>
-        </w:tc>
-        <w:tc>
-          <w:tcPr>
-            <w:tcW w:type="dxa" w:w="6236"/>
+              <w:t>File</w:t>
+            </w:r>
+          </w:p>
+        </w:tc>
+        <w:tc>
+          <w:tcPr>
+            <w:tcW w:type="dxa" w:w="2268"/>
             <w:shd w:fill="1B4F72" w:val="clear"/>
           </w:tcPr>
           <w:p>
@@ -7011,13 +6500,13 @@
                 <w:color w:val="FFFFFF"/>
                 <w:sz w:val="20"/>
               </w:rPr>
-              <w:t>Hạng mục</w:t>
-            </w:r>
-          </w:p>
-        </w:tc>
-        <w:tc>
-          <w:tcPr>
-            <w:tcW w:type="dxa" w:w="1417"/>
+              <w:t>Trạng thái</w:t>
+            </w:r>
+          </w:p>
+        </w:tc>
+        <w:tc>
+          <w:tcPr>
+            <w:tcW w:type="dxa" w:w="3969"/>
             <w:shd w:fill="1B4F72" w:val="clear"/>
           </w:tcPr>
           <w:p>
@@ -7031,7 +6520,7 @@
                 <w:color w:val="FFFFFF"/>
                 <w:sz w:val="20"/>
               </w:rPr>
-              <w:t>Trạng thái</w:t>
+              <w:t>Lý do</w:t>
             </w:r>
           </w:p>
         </w:tc>
@@ -7039,43 +6528,43 @@
       <w:tr>
         <w:tc>
           <w:tcPr>
-            <w:tcW w:type="dxa" w:w="850"/>
-          </w:tcPr>
-          <w:p>
-            <w:r/>
-            <w:r>
-              <w:rPr>
-                <w:sz w:val="20"/>
-              </w:rPr>
-              <w:t>1</w:t>
-            </w:r>
-          </w:p>
-        </w:tc>
-        <w:tc>
-          <w:tcPr>
-            <w:tcW w:type="dxa" w:w="6236"/>
-          </w:tcPr>
-          <w:p>
-            <w:r/>
-            <w:r>
-              <w:rPr>
-                <w:sz w:val="20"/>
-              </w:rPr>
-              <w:t>Đã cài Docker Desktop và chạy thành công</w:t>
-            </w:r>
-          </w:p>
-        </w:tc>
-        <w:tc>
-          <w:tcPr>
-            <w:tcW w:type="dxa" w:w="1417"/>
-          </w:tcPr>
-          <w:p>
-            <w:r/>
-            <w:r>
-              <w:rPr>
-                <w:sz w:val="20"/>
-              </w:rPr>
-              <w:t>☐</w:t>
+            <w:tcW w:type="dxa" w:w="2835"/>
+          </w:tcPr>
+          <w:p>
+            <w:r/>
+            <w:r>
+              <w:rPr>
+                <w:sz w:val="20"/>
+              </w:rPr>
+              <w:t>.env</w:t>
+            </w:r>
+          </w:p>
+        </w:tc>
+        <w:tc>
+          <w:tcPr>
+            <w:tcW w:type="dxa" w:w="2268"/>
+          </w:tcPr>
+          <w:p>
+            <w:r/>
+            <w:r>
+              <w:rPr>
+                <w:sz w:val="20"/>
+              </w:rPr>
+              <w:t>Đã commit (private repo)</w:t>
+            </w:r>
+          </w:p>
+        </w:tc>
+        <w:tc>
+          <w:tcPr>
+            <w:tcW w:type="dxa" w:w="3969"/>
+          </w:tcPr>
+          <w:p>
+            <w:r/>
+            <w:r>
+              <w:rPr>
+                <w:sz w:val="20"/>
+              </w:rPr>
+              <w:t>Chứa API key dùng chung — nhúng sẵn cho team</w:t>
             </w:r>
           </w:p>
         </w:tc>
@@ -7083,7 +6572,7 @@
       <w:tr>
         <w:tc>
           <w:tcPr>
-            <w:tcW w:type="dxa" w:w="850"/>
+            <w:tcW w:type="dxa" w:w="2835"/>
             <w:shd w:fill="F2F7FB" w:val="clear"/>
           </w:tcPr>
           <w:p>
@@ -7092,13 +6581,13 @@
               <w:rPr>
                 <w:sz w:val="20"/>
               </w:rPr>
-              <w:t>2</w:t>
-            </w:r>
-          </w:p>
-        </w:tc>
-        <w:tc>
-          <w:tcPr>
-            <w:tcW w:type="dxa" w:w="6236"/>
+              <w:t>config.yaml</w:t>
+            </w:r>
+          </w:p>
+        </w:tc>
+        <w:tc>
+          <w:tcPr>
+            <w:tcW w:type="dxa" w:w="2268"/>
             <w:shd w:fill="F2F7FB" w:val="clear"/>
           </w:tcPr>
           <w:p>
@@ -7107,13 +6596,13 @@
               <w:rPr>
                 <w:sz w:val="20"/>
               </w:rPr>
-              <w:t>Đã cài Git và cấu hình user.name, user.email</w:t>
-            </w:r>
-          </w:p>
-        </w:tc>
-        <w:tc>
-          <w:tcPr>
-            <w:tcW w:type="dxa" w:w="1417"/>
+              <w:t>Đã commit</w:t>
+            </w:r>
+          </w:p>
+        </w:tc>
+        <w:tc>
+          <w:tcPr>
+            <w:tcW w:type="dxa" w:w="3969"/>
             <w:shd w:fill="F2F7FB" w:val="clear"/>
           </w:tcPr>
           <w:p>
@@ -7122,7 +6611,7 @@
               <w:rPr>
                 <w:sz w:val="20"/>
               </w:rPr>
-              <w:t>☐</w:t>
+              <w:t>Cấu hình AI models — nhúng sẵn cho team</w:t>
             </w:r>
           </w:p>
         </w:tc>
@@ -7130,43 +6619,43 @@
       <w:tr>
         <w:tc>
           <w:tcPr>
-            <w:tcW w:type="dxa" w:w="850"/>
-          </w:tcPr>
-          <w:p>
-            <w:r/>
-            <w:r>
-              <w:rPr>
-                <w:sz w:val="20"/>
-              </w:rPr>
-              <w:t>3</w:t>
-            </w:r>
-          </w:p>
-        </w:tc>
-        <w:tc>
-          <w:tcPr>
-            <w:tcW w:type="dxa" w:w="6236"/>
-          </w:tcPr>
-          <w:p>
-            <w:r/>
-            <w:r>
-              <w:rPr>
-                <w:sz w:val="20"/>
-              </w:rPr>
-              <w:t>Đã nhận quyền Developer trên GitLab (chấp nhận lời mời)</w:t>
-            </w:r>
-          </w:p>
-        </w:tc>
-        <w:tc>
-          <w:tcPr>
-            <w:tcW w:type="dxa" w:w="1417"/>
-          </w:tcPr>
-          <w:p>
-            <w:r/>
-            <w:r>
-              <w:rPr>
-                <w:sz w:val="20"/>
-              </w:rPr>
-              <w:t>☐</w:t>
+            <w:tcW w:type="dxa" w:w="2835"/>
+          </w:tcPr>
+          <w:p>
+            <w:r/>
+            <w:r>
+              <w:rPr>
+                <w:sz w:val="20"/>
+              </w:rPr>
+              <w:t>gcloud/ folder</w:t>
+            </w:r>
+          </w:p>
+        </w:tc>
+        <w:tc>
+          <w:tcPr>
+            <w:tcW w:type="dxa" w:w="2268"/>
+          </w:tcPr>
+          <w:p>
+            <w:r/>
+            <w:r>
+              <w:rPr>
+                <w:sz w:val="20"/>
+              </w:rPr>
+              <w:t>Không commit (.gitignore)</w:t>
+            </w:r>
+          </w:p>
+        </w:tc>
+        <w:tc>
+          <w:tcPr>
+            <w:tcW w:type="dxa" w:w="3969"/>
+          </w:tcPr>
+          <w:p>
+            <w:r/>
+            <w:r>
+              <w:rPr>
+                <w:sz w:val="20"/>
+              </w:rPr>
+              <w:t>Credentials cá nhân — không dùng nữa</w:t>
             </w:r>
           </w:p>
         </w:tc>
@@ -7174,7 +6663,7 @@
       <w:tr>
         <w:tc>
           <w:tcPr>
-            <w:tcW w:type="dxa" w:w="850"/>
+            <w:tcW w:type="dxa" w:w="2835"/>
             <w:shd w:fill="F2F7FB" w:val="clear"/>
           </w:tcPr>
           <w:p>
@@ -7183,13 +6672,13 @@
               <w:rPr>
                 <w:sz w:val="20"/>
               </w:rPr>
-              <w:t>4</w:t>
-            </w:r>
-          </w:p>
-        </w:tc>
-        <w:tc>
-          <w:tcPr>
-            <w:tcW w:type="dxa" w:w="6236"/>
+              <w:t>service-account*.json</w:t>
+            </w:r>
+          </w:p>
+        </w:tc>
+        <w:tc>
+          <w:tcPr>
+            <w:tcW w:type="dxa" w:w="2268"/>
             <w:shd w:fill="F2F7FB" w:val="clear"/>
           </w:tcPr>
           <w:p>
@@ -7198,13 +6687,13 @@
               <w:rPr>
                 <w:sz w:val="20"/>
               </w:rPr>
-              <w:t>Đã tạo Personal Access Token trên GitLab</w:t>
-            </w:r>
-          </w:p>
-        </w:tc>
-        <w:tc>
-          <w:tcPr>
-            <w:tcW w:type="dxa" w:w="1417"/>
+              <w:t>Không commit</w:t>
+            </w:r>
+          </w:p>
+        </w:tc>
+        <w:tc>
+          <w:tcPr>
+            <w:tcW w:type="dxa" w:w="3969"/>
             <w:shd w:fill="F2F7FB" w:val="clear"/>
           </w:tcPr>
           <w:p>
@@ -7213,7 +6702,7 @@
               <w:rPr>
                 <w:sz w:val="20"/>
               </w:rPr>
-              <w:t>☐</w:t>
+              <w:t>Khóa tài khoản dịch vụ — không cần</w:t>
             </w:r>
           </w:p>
         </w:tc>
@@ -7221,642 +6710,148 @@
       <w:tr>
         <w:tc>
           <w:tcPr>
-            <w:tcW w:type="dxa" w:w="850"/>
-          </w:tcPr>
-          <w:p>
-            <w:r/>
-            <w:r>
-              <w:rPr>
-                <w:sz w:val="20"/>
-              </w:rPr>
-              <w:t>5</w:t>
-            </w:r>
-          </w:p>
-        </w:tc>
-        <w:tc>
-          <w:tcPr>
-            <w:tcW w:type="dxa" w:w="6236"/>
-          </w:tcPr>
-          <w:p>
-            <w:r/>
-            <w:r>
-              <w:rPr>
-                <w:sz w:val="20"/>
-              </w:rPr>
-              <w:t>Đã clone dự án thành công</w:t>
-            </w:r>
-          </w:p>
-        </w:tc>
-        <w:tc>
-          <w:tcPr>
-            <w:tcW w:type="dxa" w:w="1417"/>
-          </w:tcPr>
-          <w:p>
-            <w:r/>
-            <w:r>
-              <w:rPr>
-                <w:sz w:val="20"/>
-              </w:rPr>
-              <w:t>☐</w:t>
-            </w:r>
-          </w:p>
-        </w:tc>
-      </w:tr>
-      <w:tr>
-        <w:tc>
-          <w:tcPr>
-            <w:tcW w:type="dxa" w:w="850"/>
-            <w:shd w:fill="F2F7FB" w:val="clear"/>
-          </w:tcPr>
-          <w:p>
-            <w:r/>
-            <w:r>
-              <w:rPr>
-                <w:sz w:val="20"/>
-              </w:rPr>
-              <w:t>6</w:t>
-            </w:r>
-          </w:p>
-        </w:tc>
-        <w:tc>
-          <w:tcPr>
-            <w:tcW w:type="dxa" w:w="6236"/>
-            <w:shd w:fill="F2F7FB" w:val="clear"/>
-          </w:tcPr>
-          <w:p>
-            <w:r/>
-            <w:r>
-              <w:rPr>
-                <w:sz w:val="20"/>
-              </w:rPr>
-              <w:t>Đã checkout branch hr_domain_research</w:t>
-            </w:r>
-          </w:p>
-        </w:tc>
-        <w:tc>
-          <w:tcPr>
-            <w:tcW w:type="dxa" w:w="1417"/>
-            <w:shd w:fill="F2F7FB" w:val="clear"/>
-          </w:tcPr>
-          <w:p>
-            <w:r/>
-            <w:r>
-              <w:rPr>
-                <w:sz w:val="20"/>
-              </w:rPr>
-              <w:t>☐</w:t>
-            </w:r>
-          </w:p>
-        </w:tc>
-      </w:tr>
-      <w:tr>
-        <w:tc>
-          <w:tcPr>
-            <w:tcW w:type="dxa" w:w="850"/>
-          </w:tcPr>
-          <w:p>
-            <w:r/>
-            <w:r>
-              <w:rPr>
-                <w:sz w:val="20"/>
-              </w:rPr>
-              <w:t>7</w:t>
-            </w:r>
-          </w:p>
-        </w:tc>
-        <w:tc>
-          <w:tcPr>
-            <w:tcW w:type="dxa" w:w="6236"/>
-          </w:tcPr>
-          <w:p>
-            <w:r/>
-            <w:r>
-              <w:rPr>
-                <w:sz w:val="20"/>
-              </w:rPr>
-              <w:t>Đã cài Google Cloud SDK và chạy gcloud --version</w:t>
-            </w:r>
-          </w:p>
-        </w:tc>
-        <w:tc>
-          <w:tcPr>
-            <w:tcW w:type="dxa" w:w="1417"/>
-          </w:tcPr>
-          <w:p>
-            <w:r/>
-            <w:r>
-              <w:rPr>
-                <w:sz w:val="20"/>
-              </w:rPr>
-              <w:t>☐</w:t>
-            </w:r>
-          </w:p>
-        </w:tc>
-      </w:tr>
-      <w:tr>
-        <w:tc>
-          <w:tcPr>
-            <w:tcW w:type="dxa" w:w="850"/>
-            <w:shd w:fill="F2F7FB" w:val="clear"/>
-          </w:tcPr>
-          <w:p>
-            <w:r/>
-            <w:r>
-              <w:rPr>
-                <w:sz w:val="20"/>
-              </w:rPr>
-              <w:t>8</w:t>
-            </w:r>
-          </w:p>
-        </w:tc>
-        <w:tc>
-          <w:tcPr>
-            <w:tcW w:type="dxa" w:w="6236"/>
-            <w:shd w:fill="F2F7FB" w:val="clear"/>
-          </w:tcPr>
-          <w:p>
-            <w:r/>
-            <w:r>
-              <w:rPr>
-                <w:sz w:val="20"/>
-              </w:rPr>
-              <w:t>Đã chạy gcloud auth login bằng tài khoản @st.uel.edu.vn</w:t>
-            </w:r>
-          </w:p>
-        </w:tc>
-        <w:tc>
-          <w:tcPr>
-            <w:tcW w:type="dxa" w:w="1417"/>
-            <w:shd w:fill="F2F7FB" w:val="clear"/>
-          </w:tcPr>
-          <w:p>
-            <w:r/>
-            <w:r>
-              <w:rPr>
-                <w:sz w:val="20"/>
-              </w:rPr>
-              <w:t>☐</w:t>
-            </w:r>
-          </w:p>
-        </w:tc>
-      </w:tr>
-      <w:tr>
-        <w:tc>
-          <w:tcPr>
-            <w:tcW w:type="dxa" w:w="850"/>
-          </w:tcPr>
-          <w:p>
-            <w:r/>
-            <w:r>
-              <w:rPr>
-                <w:sz w:val="20"/>
-              </w:rPr>
-              <w:t>9</w:t>
-            </w:r>
-          </w:p>
-        </w:tc>
-        <w:tc>
-          <w:tcPr>
-            <w:tcW w:type="dxa" w:w="6236"/>
-          </w:tcPr>
-          <w:p>
-            <w:r/>
-            <w:r>
-              <w:rPr>
-                <w:sz w:val="20"/>
-              </w:rPr>
-              <w:t>Đã chạy gcloud auth application-default login</w:t>
-            </w:r>
-          </w:p>
-        </w:tc>
-        <w:tc>
-          <w:tcPr>
-            <w:tcW w:type="dxa" w:w="1417"/>
-          </w:tcPr>
-          <w:p>
-            <w:r/>
-            <w:r>
-              <w:rPr>
-                <w:sz w:val="20"/>
-              </w:rPr>
-              <w:t>☐</w:t>
-            </w:r>
-          </w:p>
-        </w:tc>
-      </w:tr>
-      <w:tr>
-        <w:tc>
-          <w:tcPr>
-            <w:tcW w:type="dxa" w:w="850"/>
-            <w:shd w:fill="F2F7FB" w:val="clear"/>
-          </w:tcPr>
-          <w:p>
-            <w:r/>
-            <w:r>
-              <w:rPr>
-                <w:sz w:val="20"/>
-              </w:rPr>
-              <w:t>10</w:t>
-            </w:r>
-          </w:p>
-        </w:tc>
-        <w:tc>
-          <w:tcPr>
-            <w:tcW w:type="dxa" w:w="6236"/>
-            <w:shd w:fill="F2F7FB" w:val="clear"/>
-          </w:tcPr>
-          <w:p>
-            <w:r/>
-            <w:r>
-              <w:rPr>
-                <w:sz w:val="20"/>
-              </w:rPr>
-              <w:t>Đã đặt quota project (gcloud auth application-default set-quota-project)</w:t>
-            </w:r>
-          </w:p>
-        </w:tc>
-        <w:tc>
-          <w:tcPr>
-            <w:tcW w:type="dxa" w:w="1417"/>
-            <w:shd w:fill="F2F7FB" w:val="clear"/>
-          </w:tcPr>
-          <w:p>
-            <w:r/>
-            <w:r>
-              <w:rPr>
-                <w:sz w:val="20"/>
-              </w:rPr>
-              <w:t>☐</w:t>
-            </w:r>
-          </w:p>
-        </w:tc>
-      </w:tr>
-      <w:tr>
-        <w:tc>
-          <w:tcPr>
-            <w:tcW w:type="dxa" w:w="850"/>
-          </w:tcPr>
-          <w:p>
-            <w:r/>
-            <w:r>
-              <w:rPr>
-                <w:sz w:val="20"/>
-              </w:rPr>
-              <w:t>11</w:t>
-            </w:r>
-          </w:p>
-        </w:tc>
-        <w:tc>
-          <w:tcPr>
-            <w:tcW w:type="dxa" w:w="6236"/>
-          </w:tcPr>
-          <w:p>
-            <w:r/>
-            <w:r>
-              <w:rPr>
-                <w:sz w:val="20"/>
-              </w:rPr>
-              <w:t>Đã copy ADC credentials vào thư mục docker/gcloud/</w:t>
-            </w:r>
-          </w:p>
-        </w:tc>
-        <w:tc>
-          <w:tcPr>
-            <w:tcW w:type="dxa" w:w="1417"/>
-          </w:tcPr>
-          <w:p>
-            <w:r/>
-            <w:r>
-              <w:rPr>
-                <w:sz w:val="20"/>
-              </w:rPr>
-              <w:t>☐</w:t>
-            </w:r>
-          </w:p>
-        </w:tc>
-      </w:tr>
-      <w:tr>
-        <w:tc>
-          <w:tcPr>
-            <w:tcW w:type="dxa" w:w="850"/>
-            <w:shd w:fill="F2F7FB" w:val="clear"/>
-          </w:tcPr>
-          <w:p>
-            <w:r/>
-            <w:r>
-              <w:rPr>
-                <w:sz w:val="20"/>
-              </w:rPr>
-              <w:t>12</w:t>
-            </w:r>
-          </w:p>
-        </w:tc>
-        <w:tc>
-          <w:tcPr>
-            <w:tcW w:type="dxa" w:w="6236"/>
-            <w:shd w:fill="F2F7FB" w:val="clear"/>
-          </w:tcPr>
-          <w:p>
-            <w:r/>
-            <w:r>
-              <w:rPr>
-                <w:sz w:val="20"/>
-              </w:rPr>
-              <w:t>Đã tạo file .env từ .env.example và điền USER_UUID</w:t>
-            </w:r>
-          </w:p>
-        </w:tc>
-        <w:tc>
-          <w:tcPr>
-            <w:tcW w:type="dxa" w:w="1417"/>
-            <w:shd w:fill="F2F7FB" w:val="clear"/>
-          </w:tcPr>
-          <w:p>
-            <w:r/>
-            <w:r>
-              <w:rPr>
-                <w:sz w:val="20"/>
-              </w:rPr>
-              <w:t>☐</w:t>
-            </w:r>
-          </w:p>
-        </w:tc>
-      </w:tr>
-      <w:tr>
-        <w:tc>
-          <w:tcPr>
-            <w:tcW w:type="dxa" w:w="850"/>
-          </w:tcPr>
-          <w:p>
-            <w:r/>
-            <w:r>
-              <w:rPr>
-                <w:sz w:val="20"/>
-              </w:rPr>
-              <w:t>13</w:t>
-            </w:r>
-          </w:p>
-        </w:tc>
-        <w:tc>
-          <w:tcPr>
-            <w:tcW w:type="dxa" w:w="6236"/>
-          </w:tcPr>
-          <w:p>
-            <w:r/>
-            <w:r>
-              <w:rPr>
-                <w:sz w:val="20"/>
-              </w:rPr>
-              <w:t>Đã chạy docker compose up -d thành công</w:t>
-            </w:r>
-          </w:p>
-        </w:tc>
-        <w:tc>
-          <w:tcPr>
-            <w:tcW w:type="dxa" w:w="1417"/>
-          </w:tcPr>
-          <w:p>
-            <w:r/>
-            <w:r>
-              <w:rPr>
-                <w:sz w:val="20"/>
-              </w:rPr>
-              <w:t>☐</w:t>
-            </w:r>
-          </w:p>
-        </w:tc>
-      </w:tr>
-      <w:tr>
-        <w:tc>
-          <w:tcPr>
-            <w:tcW w:type="dxa" w:w="850"/>
-            <w:shd w:fill="F2F7FB" w:val="clear"/>
-          </w:tcPr>
-          <w:p>
-            <w:r/>
-            <w:r>
-              <w:rPr>
-                <w:sz w:val="20"/>
-              </w:rPr>
-              <w:t>14</w:t>
-            </w:r>
-          </w:p>
-        </w:tc>
-        <w:tc>
-          <w:tcPr>
-            <w:tcW w:type="dxa" w:w="6236"/>
-            <w:shd w:fill="F2F7FB" w:val="clear"/>
-          </w:tcPr>
-          <w:p>
-            <w:r/>
-            <w:r>
-              <w:rPr>
-                <w:sz w:val="20"/>
-              </w:rPr>
-              <w:t>Đã kiểm tra 6 container đang chạy (docker ps)</w:t>
-            </w:r>
-          </w:p>
-        </w:tc>
-        <w:tc>
-          <w:tcPr>
-            <w:tcW w:type="dxa" w:w="1417"/>
-            <w:shd w:fill="F2F7FB" w:val="clear"/>
-          </w:tcPr>
-          <w:p>
-            <w:r/>
-            <w:r>
-              <w:rPr>
-                <w:sz w:val="20"/>
-              </w:rPr>
-              <w:t>☐</w:t>
-            </w:r>
-          </w:p>
-        </w:tc>
-      </w:tr>
-      <w:tr>
-        <w:tc>
-          <w:tcPr>
-            <w:tcW w:type="dxa" w:w="850"/>
-          </w:tcPr>
-          <w:p>
-            <w:r/>
-            <w:r>
-              <w:rPr>
-                <w:sz w:val="20"/>
-              </w:rPr>
-              <w:t>15</w:t>
-            </w:r>
-          </w:p>
-        </w:tc>
-        <w:tc>
-          <w:tcPr>
-            <w:tcW w:type="dxa" w:w="6236"/>
-          </w:tcPr>
-          <w:p>
-            <w:r/>
-            <w:r>
-              <w:rPr>
-                <w:sz w:val="20"/>
-              </w:rPr>
-              <w:t>Đã kiểm tra AI Service health (localhost:5555/health → ok)</w:t>
-            </w:r>
-          </w:p>
-        </w:tc>
-        <w:tc>
-          <w:tcPr>
-            <w:tcW w:type="dxa" w:w="1417"/>
-          </w:tcPr>
-          <w:p>
-            <w:r/>
-            <w:r>
-              <w:rPr>
-                <w:sz w:val="20"/>
-              </w:rPr>
-              <w:t>☐</w:t>
-            </w:r>
-          </w:p>
-        </w:tc>
-      </w:tr>
-      <w:tr>
-        <w:tc>
-          <w:tcPr>
-            <w:tcW w:type="dxa" w:w="850"/>
-            <w:shd w:fill="F2F7FB" w:val="clear"/>
-          </w:tcPr>
-          <w:p>
-            <w:r/>
-            <w:r>
-              <w:rPr>
-                <w:sz w:val="20"/>
-              </w:rPr>
-              <w:t>16</w:t>
-            </w:r>
-          </w:p>
-        </w:tc>
-        <w:tc>
-          <w:tcPr>
-            <w:tcW w:type="dxa" w:w="6236"/>
-            <w:shd w:fill="F2F7FB" w:val="clear"/>
-          </w:tcPr>
-          <w:p>
-            <w:r/>
-            <w:r>
-              <w:rPr>
-                <w:sz w:val="20"/>
-              </w:rPr>
-              <w:t>Đã mở giao diện web tại localhost:3000</w:t>
-            </w:r>
-          </w:p>
-        </w:tc>
-        <w:tc>
-          <w:tcPr>
-            <w:tcW w:type="dxa" w:w="1417"/>
-            <w:shd w:fill="F2F7FB" w:val="clear"/>
-          </w:tcPr>
-          <w:p>
-            <w:r/>
-            <w:r>
-              <w:rPr>
-                <w:sz w:val="20"/>
-              </w:rPr>
-              <w:t>☐</w:t>
-            </w:r>
-          </w:p>
-        </w:tc>
-      </w:tr>
-      <w:tr>
-        <w:tc>
-          <w:tcPr>
-            <w:tcW w:type="dxa" w:w="850"/>
-          </w:tcPr>
-          <w:p>
-            <w:r/>
-            <w:r>
-              <w:rPr>
-                <w:sz w:val="20"/>
-              </w:rPr>
-              <w:t>17</w:t>
-            </w:r>
-          </w:p>
-        </w:tc>
-        <w:tc>
-          <w:tcPr>
-            <w:tcW w:type="dxa" w:w="6236"/>
-          </w:tcPr>
-          <w:p>
-            <w:r/>
-            <w:r>
-              <w:rPr>
-                <w:sz w:val="20"/>
-              </w:rPr>
-              <w:t>Đã thử đặt 1 câu hỏi và nhận được kết quả</w:t>
-            </w:r>
-          </w:p>
-        </w:tc>
-        <w:tc>
-          <w:tcPr>
-            <w:tcW w:type="dxa" w:w="1417"/>
-          </w:tcPr>
-          <w:p>
-            <w:r/>
-            <w:r>
-              <w:rPr>
-                <w:sz w:val="20"/>
-              </w:rPr>
-              <w:t>☐</w:t>
-            </w:r>
-          </w:p>
-        </w:tc>
-      </w:tr>
-      <w:tr>
-        <w:tc>
-          <w:tcPr>
-            <w:tcW w:type="dxa" w:w="850"/>
-            <w:shd w:fill="F2F7FB" w:val="clear"/>
-          </w:tcPr>
-          <w:p>
-            <w:r/>
-            <w:r>
-              <w:rPr>
-                <w:sz w:val="20"/>
-              </w:rPr>
-              <w:t>18</w:t>
-            </w:r>
-          </w:p>
-        </w:tc>
-        <w:tc>
-          <w:tcPr>
-            <w:tcW w:type="dxa" w:w="6236"/>
-            <w:shd w:fill="F2F7FB" w:val="clear"/>
-          </w:tcPr>
-          <w:p>
-            <w:r/>
-            <w:r>
-              <w:rPr>
-                <w:sz w:val="20"/>
-              </w:rPr>
-              <w:t>Đã thử tạo 1 commit và push lên hr_domain_research</w:t>
-            </w:r>
-          </w:p>
-        </w:tc>
-        <w:tc>
-          <w:tcPr>
-            <w:tcW w:type="dxa" w:w="1417"/>
-            <w:shd w:fill="F2F7FB" w:val="clear"/>
-          </w:tcPr>
-          <w:p>
-            <w:r/>
-            <w:r>
-              <w:rPr>
-                <w:sz w:val="20"/>
-              </w:rPr>
-              <w:t>☐</w:t>
+            <w:tcW w:type="dxa" w:w="2835"/>
+          </w:tcPr>
+          <w:p>
+            <w:r/>
+            <w:r>
+              <w:rPr>
+                <w:sz w:val="20"/>
+              </w:rPr>
+              <w:t>File chứa mật khẩu SQL Server</w:t>
+            </w:r>
+          </w:p>
+        </w:tc>
+        <w:tc>
+          <w:tcPr>
+            <w:tcW w:type="dxa" w:w="2268"/>
+          </w:tcPr>
+          <w:p>
+            <w:r/>
+            <w:r>
+              <w:rPr>
+                <w:sz w:val="20"/>
+              </w:rPr>
+              <w:t>Không commit</w:t>
+            </w:r>
+          </w:p>
+        </w:tc>
+        <w:tc>
+          <w:tcPr>
+            <w:tcW w:type="dxa" w:w="3969"/>
+          </w:tcPr>
+          <w:p>
+            <w:r/>
+            <w:r>
+              <w:rPr>
+                <w:sz w:val="20"/>
+              </w:rPr>
+              <w:t>Bảo vệ truy cập database</w:t>
             </w:r>
           </w:p>
         </w:tc>
       </w:tr>
     </w:tbl>
     <w:p/>
+    <w:p>
+      <w:pPr>
+        <w:pStyle w:val="Heading2"/>
+      </w:pPr>
+      <w:r>
+        <w:t>13.2. Kiểm tra trước khi commit</w:t>
+      </w:r>
+    </w:p>
+    <w:p>
+      <w:pPr>
+        <w:spacing w:before="80" w:after="80"/>
+        <w:ind w:left="567"/>
+        <w:shd w:fill="F5F5F5" w:val="clear"/>
+      </w:pPr>
+      <w:r>
+        <w:rPr>
+          <w:rFonts w:ascii="Consolas" w:hAnsi="Consolas"/>
+          <w:color w:val="2C3E50"/>
+          <w:sz w:val="18"/>
+        </w:rPr>
+        <w:t># Luôn kiểm tra trước khi commit</w:t>
+        <w:br/>
+        <w:t>git status</w:t>
+        <w:br/>
+        <w:br/>
+        <w:t># Đảm bảo không có file credentials cá nhân hoặc file lạ</w:t>
+        <w:br/>
+        <w:t># Nếu thấy file .json chứa credentials, dừng lại và liên hệ Lead</w:t>
+      </w:r>
+    </w:p>
+    <w:p>
+      <w:pPr>
+        <w:pStyle w:val="Heading2"/>
+      </w:pPr>
+      <w:r>
+        <w:t>13.3. Nếu lỡ commit file bí mật</w:t>
+      </w:r>
+    </w:p>
+    <w:p>
+      <w:pPr>
+        <w:spacing w:before="80" w:after="80"/>
+        <w:ind w:left="567"/>
+        <w:shd w:fill="F5F5F5" w:val="clear"/>
+      </w:pPr>
+      <w:r>
+        <w:rPr>
+          <w:rFonts w:ascii="Consolas" w:hAnsi="Consolas"/>
+          <w:color w:val="2C3E50"/>
+          <w:sz w:val="18"/>
+        </w:rPr>
+        <w:t># Xóa file credentials cá nhân khỏi Git (giữ file trên máy)</w:t>
+        <w:br/>
+        <w:t>git rm --cached &lt;tên-file-credentials&gt;</w:t>
+        <w:br/>
+        <w:t>git commit -m "fix: xóa file credentials khỏi git"</w:t>
+        <w:br/>
+        <w:t>git push origin hr_domain_research</w:t>
+        <w:br/>
+        <w:br/>
+        <w:t># Nếu lỡ commit API key khác lên public repo:</w:t>
+        <w:br/>
+        <w:t># Revoke key ngay trên Google AI Studio và tạo key mới</w:t>
+      </w:r>
+    </w:p>
+    <w:p>
+      <w:pPr>
+        <w:pStyle w:val="Heading2"/>
+      </w:pPr>
+      <w:r>
+        <w:t>13.4. Bảo vệ API key</w:t>
+      </w:r>
+    </w:p>
+    <w:p>
+      <w:r>
+        <w:t>API key Gemini dùng chung cho team, được quản lý bởi Lead/Maintainer. Không chia sẻ API key ra ngoài nhóm dự án, không post lên forum/chat công khai.</w:t>
+      </w:r>
+    </w:p>
+    <w:p>
+      <w:pPr>
+        <w:spacing w:before="120" w:after="120"/>
+        <w:ind w:left="283"/>
+        <w:shd w:fill="F8D7DA" w:val="clear"/>
+      </w:pPr>
+      <w:r>
+        <w:rPr>
+          <w:b/>
+          <w:color w:val="721C24"/>
+          <w:sz w:val="20"/>
+        </w:rPr>
+        <w:t xml:space="preserve">✘ </w:t>
+      </w:r>
+      <w:r>
+        <w:rPr>
+          <w:color w:val="721C24"/>
+          <w:sz w:val="20"/>
+        </w:rPr>
+        <w:t>KHÔNG chia sẻ GEMINI_API_KEY ra ngoài nhóm dự án. Repo là private nhưng API key không nên bị lộ ra public.</w:t>
+      </w:r>
+    </w:p>
     <w:p>
       <w:pPr>
         <w:spacing w:before="120" w:after="120"/>
@@ -7876,7 +6871,760 @@
           <w:color w:val="155724"/>
           <w:sz w:val="20"/>
         </w:rPr>
-        <w:t>Nếu hoàn thành tất cả 18 bước trên, bạn đã sẵn sàng làm việc!</w:t>
+        <w:t>Nếu API key bị lộ: báo ngay cho Lead để revoke và tạo key mới trên Google AI Studio.</w:t>
+      </w:r>
+    </w:p>
+    <w:p>
+      <w:r>
+        <w:br w:type="page"/>
+      </w:r>
+    </w:p>
+    <w:p>
+      <w:pPr>
+        <w:pStyle w:val="Heading1"/>
+      </w:pPr>
+      <w:r>
+        <w:t>14. Bảng kiểm (checklist) onboarding</w:t>
+      </w:r>
+    </w:p>
+    <w:p>
+      <w:r>
+        <w:t>Đánh dấu ✓ khi hoàn thành từng bước:</w:t>
+      </w:r>
+    </w:p>
+    <w:tbl>
+      <w:tblPr>
+        <w:tblStyle w:val="TableGrid"/>
+        <w:tblW w:type="auto" w:w="0"/>
+        <w:jc w:val="center"/>
+        <w:tblLook w:firstColumn="1" w:firstRow="1" w:lastColumn="0" w:lastRow="0" w:noHBand="0" w:noVBand="1" w:val="04A0"/>
+      </w:tblPr>
+      <w:tblGrid>
+        <w:gridCol w:w="3041"/>
+        <w:gridCol w:w="3041"/>
+        <w:gridCol w:w="3041"/>
+      </w:tblGrid>
+      <w:tr>
+        <w:tc>
+          <w:tcPr>
+            <w:tcW w:type="dxa" w:w="850"/>
+            <w:shd w:fill="1B4F72" w:val="clear"/>
+          </w:tcPr>
+          <w:p>
+            <w:pPr>
+              <w:jc w:val="center"/>
+            </w:pPr>
+            <w:r/>
+            <w:r>
+              <w:rPr>
+                <w:b/>
+                <w:color w:val="FFFFFF"/>
+                <w:sz w:val="20"/>
+              </w:rPr>
+              <w:t>STT</w:t>
+            </w:r>
+          </w:p>
+        </w:tc>
+        <w:tc>
+          <w:tcPr>
+            <w:tcW w:type="dxa" w:w="6236"/>
+            <w:shd w:fill="1B4F72" w:val="clear"/>
+          </w:tcPr>
+          <w:p>
+            <w:pPr>
+              <w:jc w:val="center"/>
+            </w:pPr>
+            <w:r/>
+            <w:r>
+              <w:rPr>
+                <w:b/>
+                <w:color w:val="FFFFFF"/>
+                <w:sz w:val="20"/>
+              </w:rPr>
+              <w:t>Hạng mục</w:t>
+            </w:r>
+          </w:p>
+        </w:tc>
+        <w:tc>
+          <w:tcPr>
+            <w:tcW w:type="dxa" w:w="1417"/>
+            <w:shd w:fill="1B4F72" w:val="clear"/>
+          </w:tcPr>
+          <w:p>
+            <w:pPr>
+              <w:jc w:val="center"/>
+            </w:pPr>
+            <w:r/>
+            <w:r>
+              <w:rPr>
+                <w:b/>
+                <w:color w:val="FFFFFF"/>
+                <w:sz w:val="20"/>
+              </w:rPr>
+              <w:t>Trạng thái</w:t>
+            </w:r>
+          </w:p>
+        </w:tc>
+      </w:tr>
+      <w:tr>
+        <w:tc>
+          <w:tcPr>
+            <w:tcW w:type="dxa" w:w="850"/>
+          </w:tcPr>
+          <w:p>
+            <w:r/>
+            <w:r>
+              <w:rPr>
+                <w:sz w:val="20"/>
+              </w:rPr>
+              <w:t>1</w:t>
+            </w:r>
+          </w:p>
+        </w:tc>
+        <w:tc>
+          <w:tcPr>
+            <w:tcW w:type="dxa" w:w="6236"/>
+          </w:tcPr>
+          <w:p>
+            <w:r/>
+            <w:r>
+              <w:rPr>
+                <w:sz w:val="20"/>
+              </w:rPr>
+              <w:t>Đã cài Docker Desktop và chạy thành công</w:t>
+            </w:r>
+          </w:p>
+        </w:tc>
+        <w:tc>
+          <w:tcPr>
+            <w:tcW w:type="dxa" w:w="1417"/>
+          </w:tcPr>
+          <w:p>
+            <w:r/>
+            <w:r>
+              <w:rPr>
+                <w:sz w:val="20"/>
+              </w:rPr>
+              <w:t>☐</w:t>
+            </w:r>
+          </w:p>
+        </w:tc>
+      </w:tr>
+      <w:tr>
+        <w:tc>
+          <w:tcPr>
+            <w:tcW w:type="dxa" w:w="850"/>
+            <w:shd w:fill="F2F7FB" w:val="clear"/>
+          </w:tcPr>
+          <w:p>
+            <w:r/>
+            <w:r>
+              <w:rPr>
+                <w:sz w:val="20"/>
+              </w:rPr>
+              <w:t>2</w:t>
+            </w:r>
+          </w:p>
+        </w:tc>
+        <w:tc>
+          <w:tcPr>
+            <w:tcW w:type="dxa" w:w="6236"/>
+            <w:shd w:fill="F2F7FB" w:val="clear"/>
+          </w:tcPr>
+          <w:p>
+            <w:r/>
+            <w:r>
+              <w:rPr>
+                <w:sz w:val="20"/>
+              </w:rPr>
+              <w:t>Đã cài Git và cấu hình user.name, user.email</w:t>
+            </w:r>
+          </w:p>
+        </w:tc>
+        <w:tc>
+          <w:tcPr>
+            <w:tcW w:type="dxa" w:w="1417"/>
+            <w:shd w:fill="F2F7FB" w:val="clear"/>
+          </w:tcPr>
+          <w:p>
+            <w:r/>
+            <w:r>
+              <w:rPr>
+                <w:sz w:val="20"/>
+              </w:rPr>
+              <w:t>☐</w:t>
+            </w:r>
+          </w:p>
+        </w:tc>
+      </w:tr>
+      <w:tr>
+        <w:tc>
+          <w:tcPr>
+            <w:tcW w:type="dxa" w:w="850"/>
+          </w:tcPr>
+          <w:p>
+            <w:r/>
+            <w:r>
+              <w:rPr>
+                <w:sz w:val="20"/>
+              </w:rPr>
+              <w:t>3</w:t>
+            </w:r>
+          </w:p>
+        </w:tc>
+        <w:tc>
+          <w:tcPr>
+            <w:tcW w:type="dxa" w:w="6236"/>
+          </w:tcPr>
+          <w:p>
+            <w:r/>
+            <w:r>
+              <w:rPr>
+                <w:sz w:val="20"/>
+              </w:rPr>
+              <w:t>Đã nhận quyền Developer trên GitLab (chấp nhận lời mời)</w:t>
+            </w:r>
+          </w:p>
+        </w:tc>
+        <w:tc>
+          <w:tcPr>
+            <w:tcW w:type="dxa" w:w="1417"/>
+          </w:tcPr>
+          <w:p>
+            <w:r/>
+            <w:r>
+              <w:rPr>
+                <w:sz w:val="20"/>
+              </w:rPr>
+              <w:t>☐</w:t>
+            </w:r>
+          </w:p>
+        </w:tc>
+      </w:tr>
+      <w:tr>
+        <w:tc>
+          <w:tcPr>
+            <w:tcW w:type="dxa" w:w="850"/>
+            <w:shd w:fill="F2F7FB" w:val="clear"/>
+          </w:tcPr>
+          <w:p>
+            <w:r/>
+            <w:r>
+              <w:rPr>
+                <w:sz w:val="20"/>
+              </w:rPr>
+              <w:t>4</w:t>
+            </w:r>
+          </w:p>
+        </w:tc>
+        <w:tc>
+          <w:tcPr>
+            <w:tcW w:type="dxa" w:w="6236"/>
+            <w:shd w:fill="F2F7FB" w:val="clear"/>
+          </w:tcPr>
+          <w:p>
+            <w:r/>
+            <w:r>
+              <w:rPr>
+                <w:sz w:val="20"/>
+              </w:rPr>
+              <w:t>Đã tạo Personal Access Token trên GitLab</w:t>
+            </w:r>
+          </w:p>
+        </w:tc>
+        <w:tc>
+          <w:tcPr>
+            <w:tcW w:type="dxa" w:w="1417"/>
+            <w:shd w:fill="F2F7FB" w:val="clear"/>
+          </w:tcPr>
+          <w:p>
+            <w:r/>
+            <w:r>
+              <w:rPr>
+                <w:sz w:val="20"/>
+              </w:rPr>
+              <w:t>☐</w:t>
+            </w:r>
+          </w:p>
+        </w:tc>
+      </w:tr>
+      <w:tr>
+        <w:tc>
+          <w:tcPr>
+            <w:tcW w:type="dxa" w:w="850"/>
+          </w:tcPr>
+          <w:p>
+            <w:r/>
+            <w:r>
+              <w:rPr>
+                <w:sz w:val="20"/>
+              </w:rPr>
+              <w:t>5</w:t>
+            </w:r>
+          </w:p>
+        </w:tc>
+        <w:tc>
+          <w:tcPr>
+            <w:tcW w:type="dxa" w:w="6236"/>
+          </w:tcPr>
+          <w:p>
+            <w:r/>
+            <w:r>
+              <w:rPr>
+                <w:sz w:val="20"/>
+              </w:rPr>
+              <w:t>Đã clone dự án thành công</w:t>
+            </w:r>
+          </w:p>
+        </w:tc>
+        <w:tc>
+          <w:tcPr>
+            <w:tcW w:type="dxa" w:w="1417"/>
+          </w:tcPr>
+          <w:p>
+            <w:r/>
+            <w:r>
+              <w:rPr>
+                <w:sz w:val="20"/>
+              </w:rPr>
+              <w:t>☐</w:t>
+            </w:r>
+          </w:p>
+        </w:tc>
+      </w:tr>
+      <w:tr>
+        <w:tc>
+          <w:tcPr>
+            <w:tcW w:type="dxa" w:w="850"/>
+            <w:shd w:fill="F2F7FB" w:val="clear"/>
+          </w:tcPr>
+          <w:p>
+            <w:r/>
+            <w:r>
+              <w:rPr>
+                <w:sz w:val="20"/>
+              </w:rPr>
+              <w:t>6</w:t>
+            </w:r>
+          </w:p>
+        </w:tc>
+        <w:tc>
+          <w:tcPr>
+            <w:tcW w:type="dxa" w:w="6236"/>
+            <w:shd w:fill="F2F7FB" w:val="clear"/>
+          </w:tcPr>
+          <w:p>
+            <w:r/>
+            <w:r>
+              <w:rPr>
+                <w:sz w:val="20"/>
+              </w:rPr>
+              <w:t>Đã checkout branch hr_domain_research</w:t>
+            </w:r>
+          </w:p>
+        </w:tc>
+        <w:tc>
+          <w:tcPr>
+            <w:tcW w:type="dxa" w:w="1417"/>
+            <w:shd w:fill="F2F7FB" w:val="clear"/>
+          </w:tcPr>
+          <w:p>
+            <w:r/>
+            <w:r>
+              <w:rPr>
+                <w:sz w:val="20"/>
+              </w:rPr>
+              <w:t>☐</w:t>
+            </w:r>
+          </w:p>
+        </w:tc>
+      </w:tr>
+      <w:tr>
+        <w:tc>
+          <w:tcPr>
+            <w:tcW w:type="dxa" w:w="850"/>
+          </w:tcPr>
+          <w:p>
+            <w:r/>
+            <w:r>
+              <w:rPr>
+                <w:sz w:val="20"/>
+              </w:rPr>
+              <w:t>7</w:t>
+            </w:r>
+          </w:p>
+        </w:tc>
+        <w:tc>
+          <w:tcPr>
+            <w:tcW w:type="dxa" w:w="6236"/>
+          </w:tcPr>
+          <w:p>
+            <w:r/>
+            <w:r>
+              <w:rPr>
+                <w:sz w:val="20"/>
+              </w:rPr>
+              <w:t>Đã kiểm tra file .env tồn tại (Test-Path .env → True)</w:t>
+            </w:r>
+          </w:p>
+        </w:tc>
+        <w:tc>
+          <w:tcPr>
+            <w:tcW w:type="dxa" w:w="1417"/>
+          </w:tcPr>
+          <w:p>
+            <w:r/>
+            <w:r>
+              <w:rPr>
+                <w:sz w:val="20"/>
+              </w:rPr>
+              <w:t>☐</w:t>
+            </w:r>
+          </w:p>
+        </w:tc>
+      </w:tr>
+      <w:tr>
+        <w:tc>
+          <w:tcPr>
+            <w:tcW w:type="dxa" w:w="850"/>
+            <w:shd w:fill="F2F7FB" w:val="clear"/>
+          </w:tcPr>
+          <w:p>
+            <w:r/>
+            <w:r>
+              <w:rPr>
+                <w:sz w:val="20"/>
+              </w:rPr>
+              <w:t>8</w:t>
+            </w:r>
+          </w:p>
+        </w:tc>
+        <w:tc>
+          <w:tcPr>
+            <w:tcW w:type="dxa" w:w="6236"/>
+            <w:shd w:fill="F2F7FB" w:val="clear"/>
+          </w:tcPr>
+          <w:p>
+            <w:r/>
+            <w:r>
+              <w:rPr>
+                <w:sz w:val="20"/>
+              </w:rPr>
+              <w:t>Đã kiểm tra file config.yaml tồn tại</w:t>
+            </w:r>
+          </w:p>
+        </w:tc>
+        <w:tc>
+          <w:tcPr>
+            <w:tcW w:type="dxa" w:w="1417"/>
+            <w:shd w:fill="F2F7FB" w:val="clear"/>
+          </w:tcPr>
+          <w:p>
+            <w:r/>
+            <w:r>
+              <w:rPr>
+                <w:sz w:val="20"/>
+              </w:rPr>
+              <w:t>☐</w:t>
+            </w:r>
+          </w:p>
+        </w:tc>
+      </w:tr>
+      <w:tr>
+        <w:tc>
+          <w:tcPr>
+            <w:tcW w:type="dxa" w:w="850"/>
+          </w:tcPr>
+          <w:p>
+            <w:r/>
+            <w:r>
+              <w:rPr>
+                <w:sz w:val="20"/>
+              </w:rPr>
+              <w:t>9</w:t>
+            </w:r>
+          </w:p>
+        </w:tc>
+        <w:tc>
+          <w:tcPr>
+            <w:tcW w:type="dxa" w:w="6236"/>
+          </w:tcPr>
+          <w:p>
+            <w:r/>
+            <w:r>
+              <w:rPr>
+                <w:sz w:val="20"/>
+              </w:rPr>
+              <w:t>Đã chạy docker compose up -d thành công</w:t>
+            </w:r>
+          </w:p>
+        </w:tc>
+        <w:tc>
+          <w:tcPr>
+            <w:tcW w:type="dxa" w:w="1417"/>
+          </w:tcPr>
+          <w:p>
+            <w:r/>
+            <w:r>
+              <w:rPr>
+                <w:sz w:val="20"/>
+              </w:rPr>
+              <w:t>☐</w:t>
+            </w:r>
+          </w:p>
+        </w:tc>
+      </w:tr>
+      <w:tr>
+        <w:tc>
+          <w:tcPr>
+            <w:tcW w:type="dxa" w:w="850"/>
+            <w:shd w:fill="F2F7FB" w:val="clear"/>
+          </w:tcPr>
+          <w:p>
+            <w:r/>
+            <w:r>
+              <w:rPr>
+                <w:sz w:val="20"/>
+              </w:rPr>
+              <w:t>10</w:t>
+            </w:r>
+          </w:p>
+        </w:tc>
+        <w:tc>
+          <w:tcPr>
+            <w:tcW w:type="dxa" w:w="6236"/>
+            <w:shd w:fill="F2F7FB" w:val="clear"/>
+          </w:tcPr>
+          <w:p>
+            <w:r/>
+            <w:r>
+              <w:rPr>
+                <w:sz w:val="20"/>
+              </w:rPr>
+              <w:t>Đã kiểm tra 6 container đang chạy (docker ps)</w:t>
+            </w:r>
+          </w:p>
+        </w:tc>
+        <w:tc>
+          <w:tcPr>
+            <w:tcW w:type="dxa" w:w="1417"/>
+            <w:shd w:fill="F2F7FB" w:val="clear"/>
+          </w:tcPr>
+          <w:p>
+            <w:r/>
+            <w:r>
+              <w:rPr>
+                <w:sz w:val="20"/>
+              </w:rPr>
+              <w:t>☐</w:t>
+            </w:r>
+          </w:p>
+        </w:tc>
+      </w:tr>
+      <w:tr>
+        <w:tc>
+          <w:tcPr>
+            <w:tcW w:type="dxa" w:w="850"/>
+          </w:tcPr>
+          <w:p>
+            <w:r/>
+            <w:r>
+              <w:rPr>
+                <w:sz w:val="20"/>
+              </w:rPr>
+              <w:t>11</w:t>
+            </w:r>
+          </w:p>
+        </w:tc>
+        <w:tc>
+          <w:tcPr>
+            <w:tcW w:type="dxa" w:w="6236"/>
+          </w:tcPr>
+          <w:p>
+            <w:r/>
+            <w:r>
+              <w:rPr>
+                <w:sz w:val="20"/>
+              </w:rPr>
+              <w:t>Đã kiểm tra AI Service health (localhost:5555/health → ok)</w:t>
+            </w:r>
+          </w:p>
+        </w:tc>
+        <w:tc>
+          <w:tcPr>
+            <w:tcW w:type="dxa" w:w="1417"/>
+          </w:tcPr>
+          <w:p>
+            <w:r/>
+            <w:r>
+              <w:rPr>
+                <w:sz w:val="20"/>
+              </w:rPr>
+              <w:t>☐</w:t>
+            </w:r>
+          </w:p>
+        </w:tc>
+      </w:tr>
+      <w:tr>
+        <w:tc>
+          <w:tcPr>
+            <w:tcW w:type="dxa" w:w="850"/>
+            <w:shd w:fill="F2F7FB" w:val="clear"/>
+          </w:tcPr>
+          <w:p>
+            <w:r/>
+            <w:r>
+              <w:rPr>
+                <w:sz w:val="20"/>
+              </w:rPr>
+              <w:t>12</w:t>
+            </w:r>
+          </w:p>
+        </w:tc>
+        <w:tc>
+          <w:tcPr>
+            <w:tcW w:type="dxa" w:w="6236"/>
+            <w:shd w:fill="F2F7FB" w:val="clear"/>
+          </w:tcPr>
+          <w:p>
+            <w:r/>
+            <w:r>
+              <w:rPr>
+                <w:sz w:val="20"/>
+              </w:rPr>
+              <w:t>Đã mở giao diện web tại localhost:3000</w:t>
+            </w:r>
+          </w:p>
+        </w:tc>
+        <w:tc>
+          <w:tcPr>
+            <w:tcW w:type="dxa" w:w="1417"/>
+            <w:shd w:fill="F2F7FB" w:val="clear"/>
+          </w:tcPr>
+          <w:p>
+            <w:r/>
+            <w:r>
+              <w:rPr>
+                <w:sz w:val="20"/>
+              </w:rPr>
+              <w:t>☐</w:t>
+            </w:r>
+          </w:p>
+        </w:tc>
+      </w:tr>
+      <w:tr>
+        <w:tc>
+          <w:tcPr>
+            <w:tcW w:type="dxa" w:w="850"/>
+          </w:tcPr>
+          <w:p>
+            <w:r/>
+            <w:r>
+              <w:rPr>
+                <w:sz w:val="20"/>
+              </w:rPr>
+              <w:t>13</w:t>
+            </w:r>
+          </w:p>
+        </w:tc>
+        <w:tc>
+          <w:tcPr>
+            <w:tcW w:type="dxa" w:w="6236"/>
+          </w:tcPr>
+          <w:p>
+            <w:r/>
+            <w:r>
+              <w:rPr>
+                <w:sz w:val="20"/>
+              </w:rPr>
+              <w:t>Đã thử đặt 1 câu hỏi và nhận được kết quả</w:t>
+            </w:r>
+          </w:p>
+        </w:tc>
+        <w:tc>
+          <w:tcPr>
+            <w:tcW w:type="dxa" w:w="1417"/>
+          </w:tcPr>
+          <w:p>
+            <w:r/>
+            <w:r>
+              <w:rPr>
+                <w:sz w:val="20"/>
+              </w:rPr>
+              <w:t>☐</w:t>
+            </w:r>
+          </w:p>
+        </w:tc>
+      </w:tr>
+      <w:tr>
+        <w:tc>
+          <w:tcPr>
+            <w:tcW w:type="dxa" w:w="850"/>
+            <w:shd w:fill="F2F7FB" w:val="clear"/>
+          </w:tcPr>
+          <w:p>
+            <w:r/>
+            <w:r>
+              <w:rPr>
+                <w:sz w:val="20"/>
+              </w:rPr>
+              <w:t>14</w:t>
+            </w:r>
+          </w:p>
+        </w:tc>
+        <w:tc>
+          <w:tcPr>
+            <w:tcW w:type="dxa" w:w="6236"/>
+            <w:shd w:fill="F2F7FB" w:val="clear"/>
+          </w:tcPr>
+          <w:p>
+            <w:r/>
+            <w:r>
+              <w:rPr>
+                <w:sz w:val="20"/>
+              </w:rPr>
+              <w:t>Đã thử tạo 1 commit và push lên hr_domain_research</w:t>
+            </w:r>
+          </w:p>
+        </w:tc>
+        <w:tc>
+          <w:tcPr>
+            <w:tcW w:type="dxa" w:w="1417"/>
+            <w:shd w:fill="F2F7FB" w:val="clear"/>
+          </w:tcPr>
+          <w:p>
+            <w:r/>
+            <w:r>
+              <w:rPr>
+                <w:sz w:val="20"/>
+              </w:rPr>
+              <w:t>☐</w:t>
+            </w:r>
+          </w:p>
+        </w:tc>
+      </w:tr>
+    </w:tbl>
+    <w:p/>
+    <w:p>
+      <w:pPr>
+        <w:spacing w:before="120" w:after="120"/>
+        <w:ind w:left="283"/>
+        <w:shd w:fill="D4EDDA" w:val="clear"/>
+      </w:pPr>
+      <w:r>
+        <w:rPr>
+          <w:b/>
+          <w:color w:val="155724"/>
+          <w:sz w:val="20"/>
+        </w:rPr>
+        <w:t xml:space="preserve">✔ </w:t>
+      </w:r>
+      <w:r>
+        <w:rPr>
+          <w:color w:val="155724"/>
+          <w:sz w:val="20"/>
+        </w:rPr>
+        <w:t>Nếu hoàn thành tất cả 14 bước trên, bạn đã sẵn sàng làm việc! Chỉ cần 3 phần mềm: Docker, Git, trình duyệt web.</w:t>
       </w:r>
     </w:p>
     <w:p>
@@ -9211,7 +8959,7 @@
               <w:rPr>
                 <w:sz w:val="20"/>
               </w:rPr>
-              <w:t>Cấu hình LLM (vertex_ai/gemini-2.5-flash), embedder, pipelines</w:t>
+              <w:t>Cấu hình LLM (gemini/gemini-2.5-flash), embedder (gemini-embedding-001), pipelines</w:t>
             </w:r>
           </w:p>
         </w:tc>
@@ -11744,7 +11492,7 @@
               <w:rPr>
                 <w:sz w:val="20"/>
               </w:rPr>
-              <w:t>GCP Project ID</w:t>
+              <w:t>LLM Model</w:t>
             </w:r>
           </w:p>
         </w:tc>
@@ -11758,7 +11506,39 @@
               <w:rPr>
                 <w:sz w:val="20"/>
               </w:rPr>
-              <w:t>project-ba49e1b7-26e0-4cbf-a14</w:t>
+              <w:t>gemini/gemini-2.5-flash</w:t>
+            </w:r>
+          </w:p>
+        </w:tc>
+      </w:tr>
+      <w:tr>
+        <w:tc>
+          <w:tcPr>
+            <w:tcW w:type="dxa" w:w="2835"/>
+            <w:shd w:fill="F2F7FB" w:val="clear"/>
+          </w:tcPr>
+          <w:p>
+            <w:r/>
+            <w:r>
+              <w:rPr>
+                <w:sz w:val="20"/>
+              </w:rPr>
+              <w:t>Embedder Model</w:t>
+            </w:r>
+          </w:p>
+        </w:tc>
+        <w:tc>
+          <w:tcPr>
+            <w:tcW w:type="dxa" w:w="6236"/>
+            <w:shd w:fill="F2F7FB" w:val="clear"/>
+          </w:tcPr>
+          <w:p>
+            <w:r/>
+            <w:r>
+              <w:rPr>
+                <w:sz w:val="20"/>
+              </w:rPr>
+              <w:t>gemini/gemini-embedding-001</w:t>
             </w:r>
           </w:p>
         </w:tc>
@@ -11790,7 +11570,7 @@
         </w:rPr>
         <w:t>Tài liệu được tạo bởi nhóm dự án HR Analytics. Mọi quyền được bảo lưu.</w:t>
         <w:br/>
-        <w:t>Phiên bản 2.0 — Ngày 11/02/2026</w:t>
+        <w:t>Phiên bản 3.0 — Ngày 11/02/2026</w:t>
       </w:r>
     </w:p>
     <w:sectPr>

</xml_diff>